<commit_message>
start of the introduction
</commit_message>
<xml_diff>
--- a/doc/journal_paper.docx
+++ b/doc/journal_paper.docx
@@ -306,7 +306,33 @@
         <w:rPr>
           <w:lang w:val="en-US"/>
         </w:rPr>
-        <w:t>The paper shall include an introduction on the current research in the papers field, original solutions, experimental results analysis, conclusions and references.</w:t>
+        <w:t xml:space="preserve">Online product reviews are a widely used source of information in e-commerce systems, </w:t>
+      </w:r>
+      <w:proofErr w:type="gramStart"/>
+      <w:r>
+        <w:rPr>
+          <w:lang w:val="en-US"/>
+        </w:rPr>
+        <w:t>providing assistance to</w:t>
+      </w:r>
+      <w:proofErr w:type="gramEnd"/>
+      <w:r>
+        <w:rPr>
+          <w:lang w:val="en-US"/>
+        </w:rPr>
+        <w:t xml:space="preserve"> users in the absence of direct interaction with products. Empirical studies show that a significant proportion of consumers rely on such reviews during the decision-making process, while a non-negligible fraction of the available content is estimated to be misleading or inauthentic. Given the scale at which this data is generated and consumed, even a moderate rate of unreliable reviews can affect </w:t>
+      </w:r>
+      <w:r>
+        <w:rPr>
+          <w:lang w:val="en-US"/>
+        </w:rPr>
+        <w:t>a lot of</w:t>
+      </w:r>
+      <w:r>
+        <w:rPr>
+          <w:lang w:val="en-US"/>
+        </w:rPr>
+        <w:t xml:space="preserve"> transactions and alter the perceived quality of products. In these circumstances, identifying inauthentic review content becomes a necessary component in maintaining the integrity of online marketplaces.</w:t>
       </w:r>
     </w:p>
     <w:p>
@@ -317,12 +343,6 @@
           <w:lang w:val="en-US"/>
         </w:rPr>
       </w:pPr>
-      <w:r>
-        <w:rPr>
-          <w:lang w:val="en-US"/>
-        </w:rPr>
-        <w:t>The paper should be edited as Microsoft Word 97-2007 document (.doc or .docx) or rich text format (.rtf), with the following settings (all measures in centimeters):</w:t>
-      </w:r>
     </w:p>
     <w:p>
       <w:pPr>
@@ -872,6 +892,7 @@
         <w:jc w:val="both"/>
       </w:pPr>
       <w:r>
+        <w:lastRenderedPageBreak/>
         <w:t>[1] I. Ivan and C. Ciurea</w:t>
       </w:r>
       <w:proofErr w:type="gramStart"/>
@@ -966,8 +987,8 @@
       <w:r>
         <w:t xml:space="preserve">. </w:t>
       </w:r>
-      <w:smartTag w:uri="urn:schemas-microsoft-com:office:smarttags" w:element="place">
-        <w:smartTag w:uri="urn:schemas-microsoft-com:office:smarttags" w:element="City">
+      <w:smartTag w:uri="urn:schemas-microsoft-com:office:smarttags" w:element="City">
+        <w:smartTag w:uri="urn:schemas-microsoft-com:office:smarttags" w:element="place">
           <w:r>
             <w:t>Bucharest</w:t>
           </w:r>
@@ -988,10 +1009,10 @@
           <w:lang w:val="en-US"/>
         </w:rPr>
         <w:sectPr>
-          <w:headerReference w:type="even" r:id="rId7"/>
-          <w:headerReference w:type="default" r:id="rId8"/>
-          <w:footerReference w:type="even" r:id="rId9"/>
-          <w:footerReference w:type="default" r:id="rId10"/>
+          <w:headerReference w:type="even" r:id="rId8"/>
+          <w:headerReference w:type="default" r:id="rId9"/>
+          <w:footerReference w:type="even" r:id="rId10"/>
+          <w:footerReference w:type="default" r:id="rId11"/>
           <w:type w:val="continuous"/>
           <w:pgSz w:w="11907" w:h="16840" w:code="9"/>
           <w:pgMar w:top="1701" w:right="1134" w:bottom="1134" w:left="1418" w:header="964" w:footer="567" w:gutter="284"/>
@@ -1003,7 +1024,6 @@
         <w:rPr>
           <w:lang w:val="en-US"/>
         </w:rPr>
-        <w:lastRenderedPageBreak/>
         <w:t xml:space="preserve">[4] </w:t>
       </w:r>
       <w:smartTag w:uri="urn:schemas-microsoft-com:office:smarttags" w:element="place">
@@ -1098,7 +1118,7 @@
                     </pic:cNvPicPr>
                   </pic:nvPicPr>
                   <pic:blipFill>
-                    <a:blip r:embed="rId11">
+                    <a:blip r:embed="rId12">
                       <a:extLst>
                         <a:ext uri="{28A0092B-C50C-407E-A947-70E740481C1C}">
                           <a14:useLocalDpi xmlns:a14="http://schemas.microsoft.com/office/drawing/2010/main" val="0"/>
@@ -7123,6 +7143,7 @@
   <w:style w:type="character" w:default="1" w:styleId="Fontdeparagrafimplicit">
     <w:name w:val="Default Paragraph Font"/>
     <w:uiPriority w:val="1"/>
+    <w:semiHidden/>
     <w:unhideWhenUsed/>
   </w:style>
   <w:style w:type="table" w:default="1" w:styleId="TabelNormal">
@@ -8023,4 +8044,16 @@
     </a:ext>
   </a:extLst>
 </a:theme>
+</file>
+
+<file path=customXml/item1.xml><?xml version="1.0" encoding="utf-8"?>
+<b:Sources xmlns:b="http://schemas.openxmlformats.org/officeDocument/2006/bibliography" xmlns="http://schemas.openxmlformats.org/officeDocument/2006/bibliography" SelectedStyle="\APASixthEditionOfficeOnline.xsl" StyleName="APA" Version="6"/>
+</file>
+
+<file path=customXml/itemProps1.xml><?xml version="1.0" encoding="utf-8"?>
+<ds:datastoreItem xmlns:ds="http://schemas.openxmlformats.org/officeDocument/2006/customXml" ds:itemID="{F075625B-B613-425A-BEAD-8B68C1DE3C37}">
+  <ds:schemaRefs>
+    <ds:schemaRef ds:uri="http://schemas.openxmlformats.org/officeDocument/2006/bibliography"/>
+  </ds:schemaRefs>
+</ds:datastoreItem>
 </file>
</xml_diff>

<commit_message>
abstract + intro done
</commit_message>
<xml_diff>
--- a/doc/journal_paper.docx
+++ b/doc/journal_paper.docx
@@ -46,40 +46,31 @@
         <w:rPr>
           <w:lang w:val="en-US"/>
         </w:rPr>
-        <w:t>First AUTHOR</w:t>
-      </w:r>
-      <w:r>
-        <w:rPr>
-          <w:vertAlign w:val="superscript"/>
-          <w:lang w:val="en-US"/>
-        </w:rPr>
-        <w:t>1</w:t>
-      </w:r>
-      <w:r>
-        <w:rPr>
-          <w:lang w:val="en-US"/>
-        </w:rPr>
-        <w:t>, Second AUTHOR</w:t>
-      </w:r>
-      <w:r>
-        <w:rPr>
-          <w:vertAlign w:val="superscript"/>
-          <w:lang w:val="en-US"/>
-        </w:rPr>
-        <w:t>2</w:t>
-      </w:r>
-      <w:r>
-        <w:rPr>
-          <w:lang w:val="en-US"/>
-        </w:rPr>
-        <w:t>, Third AUTHOR</w:t>
-      </w:r>
-      <w:r>
-        <w:rPr>
-          <w:vertAlign w:val="superscript"/>
-          <w:lang w:val="en-US"/>
-        </w:rPr>
-        <w:t>3</w:t>
+        <w:t>Sebastian</w:t>
+      </w:r>
+      <w:r>
+        <w:rPr>
+          <w:lang w:val="en-US"/>
+        </w:rPr>
+        <w:t xml:space="preserve"> </w:t>
+      </w:r>
+      <w:r>
+        <w:rPr>
+          <w:lang w:val="en-US"/>
+        </w:rPr>
+        <w:t>TONU</w:t>
+      </w:r>
+      <w:r>
+        <w:rPr>
+          <w:lang w:val="en-US"/>
+        </w:rPr>
+        <w:t xml:space="preserve">, </w:t>
+      </w:r>
+      <w:r>
+        <w:rPr>
+          <w:lang w:val="en-US"/>
+        </w:rPr>
+        <w:t>Ioana-Alexandra TONU</w:t>
       </w:r>
     </w:p>
     <w:p>
@@ -92,13 +83,6 @@
       </w:pPr>
       <w:r>
         <w:rPr>
-          <w:vertAlign w:val="superscript"/>
-          <w:lang w:val="en-US"/>
-        </w:rPr>
-        <w:t>1</w:t>
-      </w:r>
-      <w:r>
-        <w:rPr>
           <w:lang w:val="en-US"/>
         </w:rPr>
         <w:t>First author affiliation</w:t>
@@ -114,16 +98,21 @@
       </w:pPr>
       <w:r>
         <w:rPr>
-          <w:vertAlign w:val="superscript"/>
-          <w:lang w:val="en-US"/>
-        </w:rPr>
-        <w:t>2</w:t>
-      </w:r>
-      <w:r>
-        <w:rPr>
-          <w:lang w:val="en-US"/>
-        </w:rPr>
-        <w:t>Second author affiliation</w:t>
+          <w:lang w:val="en-US"/>
+        </w:rPr>
+        <w:t>sebastian.tonu@academic.tuiasi.ro</w:t>
+      </w:r>
+      <w:r>
+        <w:rPr>
+          <w:lang w:val="en-US"/>
+        </w:rPr>
+        <w:t xml:space="preserve">, </w:t>
+      </w:r>
+      <w:r>
+        <w:rPr>
+          <w:lang w:val="en-US"/>
+        </w:rPr>
+        <w:t>ioana-alexandra.tonu@student.tuiasi.ro</w:t>
       </w:r>
     </w:p>
     <w:p>
@@ -134,94 +123,68 @@
           <w:lang w:val="en-US"/>
         </w:rPr>
       </w:pPr>
-      <w:r>
-        <w:rPr>
-          <w:vertAlign w:val="superscript"/>
-          <w:lang w:val="en-US"/>
-        </w:rPr>
-        <w:t>3</w:t>
-      </w:r>
-      <w:r>
-        <w:rPr>
-          <w:lang w:val="en-US"/>
-        </w:rPr>
-        <w:t>Third author affiliation</w:t>
-      </w:r>
     </w:p>
     <w:p>
       <w:pPr>
         <w:widowControl w:val="0"/>
-        <w:jc w:val="center"/>
-        <w:rPr>
-          <w:lang w:val="en-US"/>
-        </w:rPr>
-      </w:pPr>
-      <w:r>
-        <w:rPr>
-          <w:lang w:val="en-US"/>
-        </w:rPr>
-        <w:t>First author email, Second author email, Third author email</w:t>
+        <w:jc w:val="both"/>
+        <w:rPr>
+          <w:i/>
+          <w:lang w:val="en-US"/>
+        </w:rPr>
+      </w:pPr>
+      <w:r>
+        <w:rPr>
+          <w:i/>
+          <w:lang w:val="en-US"/>
+        </w:rPr>
+        <w:t xml:space="preserve">The </w:t>
+      </w:r>
+      <w:r>
+        <w:rPr>
+          <w:i/>
+          <w:lang w:val="en-US"/>
+        </w:rPr>
+        <w:t>increased</w:t>
+      </w:r>
+      <w:r>
+        <w:rPr>
+          <w:i/>
+          <w:lang w:val="en-US"/>
+        </w:rPr>
+        <w:t xml:space="preserve"> use of online product reviews has made them a key factor in consumer decision-making processes within e-commerce platforms. </w:t>
+      </w:r>
+      <w:r>
+        <w:rPr>
+          <w:i/>
+        </w:rPr>
+        <w:t>In this context,</w:t>
+      </w:r>
+      <w:r>
+        <w:rPr>
+          <w:i/>
+          <w:lang w:val="en-US"/>
+        </w:rPr>
+        <w:t xml:space="preserve"> recent advances in large language models</w:t>
+      </w:r>
+      <w:r>
+        <w:rPr>
+          <w:i/>
+          <w:lang w:val="en-US"/>
+        </w:rPr>
+        <w:t xml:space="preserve"> (LLMs)</w:t>
+      </w:r>
+      <w:r>
+        <w:rPr>
+          <w:i/>
+          <w:lang w:val="en-US"/>
+        </w:rPr>
+        <w:t xml:space="preserve"> have enabled the generation of artificial reviews that closely resemble human-written content, raising concerns regarding their impact. This paper proposes a practical approach for detecting AI-generated product reviews based on classical machine learning techniques. A dataset is constructed by combining real user reviews with content generated using a large language model, followed by a preprocessing stage for data standardization. The classification task is addressed using TF-IDF features and a linear Support Vector Machine model. In addition, an explainability component based on SHAP is employed to analyze the contribution of individual linguistic features to the model predictions. The experimental results indicate that the proposed approach achieves high classification performance while also providing interpretable insights into the patterns that differentiate generated and authentic reviews.</w:t>
       </w:r>
     </w:p>
     <w:p>
       <w:pPr>
         <w:widowControl w:val="0"/>
-        <w:jc w:val="center"/>
-        <w:rPr>
-          <w:lang w:val="en-US"/>
-        </w:rPr>
-      </w:pPr>
-    </w:p>
-    <w:p>
-      <w:pPr>
-        <w:widowControl w:val="0"/>
-        <w:jc w:val="both"/>
-        <w:rPr>
-          <w:i/>
-          <w:lang w:val="en-US"/>
-        </w:rPr>
-      </w:pPr>
-      <w:r>
-        <w:rPr>
-          <w:i/>
-          <w:lang w:val="en-US"/>
-        </w:rPr>
-        <w:t xml:space="preserve">This document gives formatting instructions for authors preparing papers for publication in the Informatica </w:t>
-      </w:r>
-      <w:proofErr w:type="spellStart"/>
-      <w:r>
-        <w:rPr>
-          <w:i/>
-          <w:lang w:val="en-US"/>
-        </w:rPr>
-        <w:t>Economică</w:t>
-      </w:r>
-      <w:proofErr w:type="spellEnd"/>
-      <w:r>
-        <w:rPr>
-          <w:i/>
-          <w:lang w:val="en-US"/>
-        </w:rPr>
-        <w:t xml:space="preserve"> </w:t>
-      </w:r>
-      <w:r>
-        <w:rPr>
-          <w:i/>
-          <w:lang w:val="en-US"/>
-        </w:rPr>
-        <w:t>j</w:t>
-      </w:r>
-      <w:r>
-        <w:rPr>
-          <w:i/>
-          <w:lang w:val="en-US"/>
-        </w:rPr>
-        <w:t>ournal. In the abstract, please describe your paper using between 100 and 150 words. Use Times New Roman, 12, italic font style. The authors must follow the instructions given in the document for the papers to be published. You can use this document as both an instruction set and as a template into which you can type your own text.</w:t>
-      </w:r>
-    </w:p>
-    <w:p>
-      <w:pPr>
-        <w:widowControl w:val="0"/>
         <w:jc w:val="both"/>
         <w:rPr>
           <w:i/>
@@ -241,7 +204,28 @@
           <w:i/>
           <w:lang w:val="en-US"/>
         </w:rPr>
-        <w:t xml:space="preserve"> Keyword1, Keyword2, Keyword3, Keyword4, Keyword5</w:t>
+        <w:t xml:space="preserve"> </w:t>
+      </w:r>
+      <w:r>
+        <w:rPr>
+          <w:i/>
+          <w:lang w:val="en-US"/>
+        </w:rPr>
+        <w:t>fake reviews</w:t>
+      </w:r>
+      <w:r>
+        <w:rPr>
+          <w:i/>
+          <w:lang w:val="en-US"/>
+        </w:rPr>
+        <w:t>, LLM</w:t>
+      </w:r>
+      <w:r>
+        <w:rPr>
+          <w:i/>
+          <w:lang w:val="en-US"/>
+        </w:rPr>
+        <w:t>, TF-IDF, support vector machine, explainable AI</w:t>
       </w:r>
     </w:p>
     <w:p>
@@ -308,14 +292,12 @@
         </w:rPr>
         <w:t xml:space="preserve">Online product reviews are a widely used source of information in e-commerce systems, </w:t>
       </w:r>
-      <w:proofErr w:type="gramStart"/>
-      <w:r>
-        <w:rPr>
-          <w:lang w:val="en-US"/>
-        </w:rPr>
-        <w:t>providing assistance to</w:t>
-      </w:r>
-      <w:proofErr w:type="gramEnd"/>
+      <w:r>
+        <w:rPr>
+          <w:lang w:val="en-US"/>
+        </w:rPr>
+        <w:t>helping</w:t>
+      </w:r>
       <w:r>
         <w:rPr>
           <w:lang w:val="en-US"/>
@@ -323,16 +305,143 @@
         <w:t xml:space="preserve"> users in the absence of direct interaction with products. Empirical studies show that a significant proportion of consumers rely on such reviews during the decision-making process, while a non-negligible fraction of the available content is estimated to be misleading or inauthentic. Given the scale at which this data is generated and consumed, even a moderate rate of unreliable reviews can affect </w:t>
       </w:r>
       <w:r>
-        <w:rPr>
-          <w:lang w:val="en-US"/>
-        </w:rPr>
-        <w:t>a lot of</w:t>
-      </w:r>
-      <w:r>
-        <w:rPr>
-          <w:lang w:val="en-US"/>
-        </w:rPr>
-        <w:t xml:space="preserve"> transactions and alter the perceived quality of products. In these circumstances, identifying inauthentic review content becomes a necessary component in maintaining the integrity of online marketplaces.</w:t>
+        <w:t>a large number of transactions</w:t>
+      </w:r>
+      <w:r>
+        <w:rPr>
+          <w:lang w:val="en-US"/>
+        </w:rPr>
+        <w:t xml:space="preserve"> </w:t>
+      </w:r>
+      <w:r>
+        <w:rPr>
+          <w:lang w:val="en-US"/>
+        </w:rPr>
+        <w:t xml:space="preserve"> and alter the perceived quality of products. In these circumstances, identifying inauthentic review content becomes a necessary component in maintaining the integrity of online marketplaces.</w:t>
+      </w:r>
+      <w:r>
+        <w:rPr>
+          <w:lang w:val="en-US"/>
+        </w:rPr>
+        <w:t xml:space="preserve"> </w:t>
+      </w:r>
+    </w:p>
+    <w:p>
+      <w:pPr>
+        <w:widowControl w:val="0"/>
+        <w:jc w:val="both"/>
+        <w:rPr>
+          <w:lang w:val="en-US"/>
+        </w:rPr>
+      </w:pPr>
+      <w:r>
+        <w:rPr>
+          <w:lang w:val="en-US"/>
+        </w:rPr>
+        <w:tab/>
+      </w:r>
+      <w:r>
+        <w:rPr>
+          <w:lang w:val="en-US"/>
+        </w:rPr>
+        <w:t>Large language models enable the generation of structured and fluent text that can approximate human-written product reviews. When applied at scale, such systems can produce content that is difficult to distinguish from authentic user feedback.</w:t>
+      </w:r>
+      <w:r>
+        <w:rPr>
+          <w:lang w:val="en-US"/>
+        </w:rPr>
+        <w:t xml:space="preserve"> In such a scenario</w:t>
+      </w:r>
+      <w:r>
+        <w:rPr>
+          <w:lang w:val="en-US"/>
+        </w:rPr>
+        <w:t>, the pre</w:t>
+      </w:r>
+      <w:r>
+        <w:rPr>
+          <w:lang w:val="en-US"/>
+        </w:rPr>
+        <w:t>s</w:t>
+      </w:r>
+      <w:r>
+        <w:rPr>
+          <w:lang w:val="en-US"/>
+        </w:rPr>
+        <w:t>ence of artificially generated reviews increases the ambiguity of the available information.</w:t>
+      </w:r>
+    </w:p>
+    <w:p>
+      <w:pPr>
+        <w:widowControl w:val="0"/>
+        <w:jc w:val="both"/>
+        <w:rPr>
+          <w:lang w:val="en-US"/>
+        </w:rPr>
+      </w:pPr>
+      <w:r>
+        <w:rPr>
+          <w:lang w:val="en-US"/>
+        </w:rPr>
+        <w:tab/>
+      </w:r>
+      <w:r>
+        <w:rPr>
+          <w:lang w:val="en-US"/>
+        </w:rPr>
+        <w:t xml:space="preserve">Existing methods for detecting deceptive reviews are typically developed for human-generated content and rely on assumptions that do not fully apply to text produced by large language models. Due to the increased regularity and fluency of generated text, the performance of such methods may degrade in this setting. </w:t>
+      </w:r>
+      <w:r>
+        <w:rPr>
+          <w:lang w:val="en-US"/>
+        </w:rPr>
+        <w:t xml:space="preserve">A </w:t>
+      </w:r>
+      <w:r>
+        <w:rPr>
+          <w:lang w:val="en-US"/>
+        </w:rPr>
+        <w:t>significant part of the existing work focuses on classification accuracy, while offering limited insight into the factors driving model decisions. This creates the need for approaches that combine effective detection with interpretable representations of the underlying patterns.</w:t>
+      </w:r>
+    </w:p>
+    <w:p>
+      <w:pPr>
+        <w:widowControl w:val="0"/>
+        <w:jc w:val="both"/>
+        <w:rPr>
+          <w:lang w:val="en-US"/>
+        </w:rPr>
+      </w:pPr>
+      <w:r>
+        <w:rPr>
+          <w:lang w:val="en-US"/>
+        </w:rPr>
+        <w:tab/>
+      </w:r>
+      <w:r>
+        <w:rPr>
+          <w:lang w:val="en-US"/>
+        </w:rPr>
+        <w:t xml:space="preserve">This paper proposes a practical approach for detecting AI-generated product reviews based on classical machine learning techniques. A dataset is constructed by combining real user reviews with artificially generated content obtained using a large language model, followed by a preprocessing stage aimed at removing noise and standardizing the input data. The classification task is addressed using a TF-IDF representation and a linear Support Vector Machine model, selected for its simplicity and effectiveness in high-dimensional text spaces. In addition, an explainability component based on SHAP is introduced </w:t>
+      </w:r>
+      <w:r>
+        <w:rPr>
+          <w:lang w:val="en-US"/>
+        </w:rPr>
+        <w:t>to</w:t>
+      </w:r>
+      <w:r>
+        <w:rPr>
+          <w:lang w:val="en-US"/>
+        </w:rPr>
+        <w:t xml:space="preserve"> analyze the contribution of individual linguistic features to the model predictions. The results show that the proposed approach achieves high classification performance, while also providing interpretable insights into the </w:t>
+      </w:r>
+      <w:r>
+        <w:rPr>
+          <w:lang w:val="en-US"/>
+        </w:rPr>
+        <w:lastRenderedPageBreak/>
+        <w:t>patterns that differentiate generated and authentic reviews.</w:t>
       </w:r>
     </w:p>
     <w:p>
@@ -887,21 +996,24 @@
     </w:p>
     <w:p>
       <w:pPr>
+        <w:pStyle w:val="NormalWeb"/>
+        <w:widowControl w:val="0"/>
+        <w:spacing w:before="0" w:beforeAutospacing="0" w:after="0" w:afterAutospacing="0"/>
+        <w:jc w:val="both"/>
+        <w:rPr>
+          <w:b/>
+          <w:lang w:val="en-US"/>
+        </w:rPr>
+      </w:pPr>
+    </w:p>
+    <w:p>
+      <w:pPr>
         <w:pStyle w:val="Default"/>
         <w:ind w:left="340" w:hanging="340"/>
         <w:jc w:val="both"/>
       </w:pPr>
       <w:r>
-        <w:lastRenderedPageBreak/>
-        <w:t>[1] I. Ivan and C. Ciurea</w:t>
-      </w:r>
-      <w:proofErr w:type="gramStart"/>
-      <w:r>
-        <w:t>, ”Quality</w:t>
-      </w:r>
-      <w:proofErr w:type="gramEnd"/>
-      <w:r>
-        <w:t xml:space="preserve"> characteristics of collaborative systems,” in </w:t>
+        <w:t xml:space="preserve">[1] I. Ivan and C. Ciurea, ”Quality characteristics of collaborative systems,” in </w:t>
       </w:r>
       <w:r>
         <w:rPr>
@@ -930,6 +1042,19 @@
       </w:smartTag>
       <w:r>
         <w:t xml:space="preserve">, 2009, pp. 164-168. </w:t>
+      </w:r>
+    </w:p>
+    <w:p>
+      <w:pPr>
+        <w:pStyle w:val="Default"/>
+        <w:ind w:left="340" w:hanging="340"/>
+        <w:jc w:val="both"/>
+      </w:pPr>
+      <w:r>
+        <w:t>[1]</w:t>
+      </w:r>
+      <w:r>
+        <w:t xml:space="preserve"> S. Senecal and J. Nantel, "The influence of online product recommendations on consumers’ online choices," Journal of Retailing, vol. 80, no. 2, pp. 159–169, 2004.</w:t>
       </w:r>
     </w:p>
     <w:p>
@@ -7143,7 +7268,6 @@
   <w:style w:type="character" w:default="1" w:styleId="Fontdeparagrafimplicit">
     <w:name w:val="Default Paragraph Font"/>
     <w:uiPriority w:val="1"/>
-    <w:semiHidden/>
     <w:unhideWhenUsed/>
   </w:style>
   <w:style w:type="table" w:default="1" w:styleId="TabelNormal">
@@ -7782,6 +7906,14 @@
       </w:numPr>
     </w:pPr>
   </w:style>
+  <w:style w:type="paragraph" w:styleId="Bibliografie">
+    <w:name w:val="Bibliography"/>
+    <w:basedOn w:val="Normal"/>
+    <w:next w:val="Normal"/>
+    <w:uiPriority w:val="37"/>
+    <w:unhideWhenUsed/>
+    <w:rsid w:val="008D0E8D"/>
+  </w:style>
 </w:styles>
 </file>
 
@@ -8047,11 +8179,28 @@
 </file>
 
 <file path=customXml/item1.xml><?xml version="1.0" encoding="utf-8"?>
-<b:Sources xmlns:b="http://schemas.openxmlformats.org/officeDocument/2006/bibliography" xmlns="http://schemas.openxmlformats.org/officeDocument/2006/bibliography" SelectedStyle="\APASixthEditionOfficeOnline.xsl" StyleName="APA" Version="6"/>
+<b:Sources xmlns:b="http://schemas.openxmlformats.org/officeDocument/2006/bibliography" xmlns="http://schemas.openxmlformats.org/officeDocument/2006/bibliography" SelectedStyle="\APASixthEditionOfficeOnline.xsl" StyleName="APA" Version="6">
+  <b:Source>
+    <b:Tag>1</b:Tag>
+    <b:SourceType>JournalArticle</b:SourceType>
+    <b:Guid>{5894357B-AA9D-4A4D-B45D-63BCB0440EEB}</b:Guid>
+    <b:Author>
+      <b:Author>
+        <b:NameList>
+          <b:Person>
+            <b:Last>a</b:Last>
+          </b:Person>
+        </b:NameList>
+      </b:Author>
+    </b:Author>
+    <b:Title>juyg</b:Title>
+    <b:RefOrder>1</b:RefOrder>
+  </b:Source>
+</b:Sources>
 </file>
 
 <file path=customXml/itemProps1.xml><?xml version="1.0" encoding="utf-8"?>
-<ds:datastoreItem xmlns:ds="http://schemas.openxmlformats.org/officeDocument/2006/customXml" ds:itemID="{F075625B-B613-425A-BEAD-8B68C1DE3C37}">
+<ds:datastoreItem xmlns:ds="http://schemas.openxmlformats.org/officeDocument/2006/customXml" ds:itemID="{F553BD8C-2007-42C6-A3EC-41325D959044}">
   <ds:schemaRefs>
     <ds:schemaRef ds:uri="http://schemas.openxmlformats.org/officeDocument/2006/bibliography"/>
   </ds:schemaRefs>

</xml_diff>

<commit_message>
experimental chapter begin (part 1)
</commit_message>
<xml_diff>
--- a/doc/journal_paper.docx
+++ b/doc/journal_paper.docx
@@ -1728,35 +1728,7 @@
           <w:bCs w:val="0"/>
           <w:lang w:val="en-US"/>
         </w:rPr>
-        <w:t xml:space="preserve">The dataset was divided into training and testing subsets </w:t>
-      </w:r>
-      <w:r>
-        <w:rPr>
-          <w:bCs w:val="0"/>
-          <w:lang w:val="en-US"/>
-        </w:rPr>
-        <w:t>to</w:t>
-      </w:r>
-      <w:r>
-        <w:rPr>
-          <w:bCs w:val="0"/>
-          <w:lang w:val="en-US"/>
-        </w:rPr>
-        <w:t xml:space="preserve"> evaluate the generalization capability of the models. Standard classification metrics were used to assess performance. An explainability analysis was further conducted using SHAP, applied to the Logistic Regression model, </w:t>
-      </w:r>
-      <w:r>
-        <w:rPr>
-          <w:bCs w:val="0"/>
-          <w:lang w:val="en-US"/>
-        </w:rPr>
-        <w:t>to</w:t>
-      </w:r>
-      <w:r>
-        <w:rPr>
-          <w:bCs w:val="0"/>
-          <w:lang w:val="en-US"/>
-        </w:rPr>
-        <w:t xml:space="preserve"> investigate the contribution of individual features to the predictio</w:t>
+        <w:t>The dataset was divided into training and testing subsets to evaluate the generalization capability of the models. Standard classification metrics were used to assess performance. An explainability analysis was further conducted using SHAP, applied to the Logistic Regression model, to investigate the contribution of individual features to the predictio</w:t>
       </w:r>
       <w:r>
         <w:rPr>
@@ -1863,25 +1835,117 @@
         <w:autoSpaceDE w:val="0"/>
         <w:autoSpaceDN w:val="0"/>
         <w:adjustRightInd w:val="0"/>
+        <w:ind w:firstLine="720"/>
         <w:jc w:val="both"/>
         <w:rPr>
-          <w:b/>
-          <w:lang w:val="en-US"/>
-        </w:rPr>
-      </w:pPr>
-      <w:r>
-        <w:rPr>
-          <w:b/>
-          <w:lang w:val="en-US"/>
-        </w:rPr>
-        <w:t xml:space="preserve">5.2 </w:t>
-      </w:r>
-      <w:r>
-        <w:rPr>
-          <w:b/>
-          <w:lang w:val="en-US"/>
-        </w:rPr>
-        <w:t>Results</w:t>
+          <w:bCs w:val="0"/>
+          <w:lang w:val="en-US"/>
+        </w:rPr>
+      </w:pPr>
+      <w:r>
+        <w:rPr>
+          <w:bCs w:val="0"/>
+          <w:lang w:val="en-US"/>
+        </w:rPr>
+        <w:t>The experimental evaluation was conducted on the dataset described in Section 3, consisting of 5,893 labeled reviews, including 3,000 real samples and 2,893 AI-generated samples. Since the dataset is approximately balanced, no additional resampling or class balancing techniques were applied.</w:t>
+      </w:r>
+      <w:r>
+        <w:rPr>
+          <w:bCs w:val="0"/>
+          <w:lang w:val="en-US"/>
+        </w:rPr>
+        <w:t xml:space="preserve"> </w:t>
+      </w:r>
+      <w:r>
+        <w:rPr>
+          <w:bCs w:val="0"/>
+          <w:lang w:val="en-US"/>
+        </w:rPr>
+        <w:t xml:space="preserve">The dataset was divided into training and testing subsets using an 80/20 split. A stratified partitioning strategy was employed </w:t>
+      </w:r>
+      <w:r>
+        <w:rPr>
+          <w:bCs w:val="0"/>
+          <w:lang w:val="en-US"/>
+        </w:rPr>
+        <w:t>to</w:t>
+      </w:r>
+      <w:r>
+        <w:rPr>
+          <w:bCs w:val="0"/>
+          <w:lang w:val="en-US"/>
+        </w:rPr>
+        <w:t xml:space="preserve"> preserve the class distribution in both subsets and to ensure a fair evaluation of the models under comparable conditions.</w:t>
+      </w:r>
+    </w:p>
+    <w:p>
+      <w:pPr>
+        <w:widowControl w:val="0"/>
+        <w:autoSpaceDE w:val="0"/>
+        <w:autoSpaceDN w:val="0"/>
+        <w:adjustRightInd w:val="0"/>
+        <w:ind w:firstLine="720"/>
+        <w:jc w:val="both"/>
+        <w:rPr>
+          <w:bCs w:val="0"/>
+          <w:lang w:val="en-US"/>
+        </w:rPr>
+      </w:pPr>
+      <w:r>
+        <w:rPr>
+          <w:bCs w:val="0"/>
+          <w:lang w:val="en-US"/>
+        </w:rPr>
+        <w:t>Two classification settings were considered. The first corresponds to a baseline model based on simple surface features extracted from the text, including length-related and structural characteristics. This baseline was implemented using Logistic Regression and was intended to provide a reference point for assessing the discriminative contribution of more informative lexical representations. The second setting corresponds to the proposed approach, where the review texts were represented using TF-IDF features computed over unigrams and bigrams, and the resulting vectors were classified using a linear Support Vector Machine model.</w:t>
+      </w:r>
+    </w:p>
+    <w:p>
+      <w:pPr>
+        <w:widowControl w:val="0"/>
+        <w:autoSpaceDE w:val="0"/>
+        <w:autoSpaceDN w:val="0"/>
+        <w:adjustRightInd w:val="0"/>
+        <w:ind w:firstLine="720"/>
+        <w:jc w:val="both"/>
+        <w:rPr>
+          <w:bCs w:val="0"/>
+          <w:lang w:val="en-US"/>
+        </w:rPr>
+      </w:pPr>
+      <w:r>
+        <w:rPr>
+          <w:bCs w:val="0"/>
+          <w:lang w:val="en-US"/>
+        </w:rPr>
+        <w:t xml:space="preserve">The performance of the evaluated models was assessed using standard classification metrics, namely accuracy, precision, recall, and F1-score. These measures were selected </w:t>
+      </w:r>
+      <w:r>
+        <w:rPr>
+          <w:bCs w:val="0"/>
+          <w:lang w:val="en-US"/>
+        </w:rPr>
+        <w:t>to</w:t>
+      </w:r>
+      <w:r>
+        <w:rPr>
+          <w:bCs w:val="0"/>
+          <w:lang w:val="en-US"/>
+        </w:rPr>
+        <w:t xml:space="preserve"> provide a consistent evaluation of classification quality across both classes. In addition, the confusion matrix of the main model was analyzed </w:t>
+      </w:r>
+      <w:r>
+        <w:rPr>
+          <w:bCs w:val="0"/>
+          <w:lang w:val="en-US"/>
+        </w:rPr>
+        <w:t>to</w:t>
+      </w:r>
+      <w:r>
+        <w:rPr>
+          <w:bCs w:val="0"/>
+          <w:lang w:val="en-US"/>
+        </w:rPr>
+        <w:t xml:space="preserve"> examine the distribution of correct and incorrect predictions.</w:t>
       </w:r>
     </w:p>
     <w:p>
@@ -1896,6 +1960,20 @@
           <w:lang w:val="en-US"/>
         </w:rPr>
       </w:pPr>
+      <w:r>
+        <w:rPr>
+          <w:b/>
+          <w:lang w:val="en-US"/>
+        </w:rPr>
+        <w:t xml:space="preserve">5.2 </w:t>
+      </w:r>
+      <w:r>
+        <w:rPr>
+          <w:b/>
+          <w:lang w:val="en-US"/>
+        </w:rPr>
+        <w:t>Results</w:t>
+      </w:r>
     </w:p>
     <w:p>
       <w:pPr>
@@ -1909,27 +1987,6 @@
           <w:lang w:val="en-US"/>
         </w:rPr>
       </w:pPr>
-      <w:r>
-        <w:rPr>
-          <w:b/>
-          <w:lang w:val="en-US"/>
-        </w:rPr>
-        <w:t xml:space="preserve">6 </w:t>
-      </w:r>
-      <w:r>
-        <w:rPr>
-          <w:b/>
-          <w:lang w:val="en-US"/>
-        </w:rPr>
-        <w:t>Explainability Analysi</w:t>
-      </w:r>
-      <w:r>
-        <w:rPr>
-          <w:b/>
-          <w:lang w:val="en-US"/>
-        </w:rPr>
-        <w:t>s</w:t>
-      </w:r>
     </w:p>
     <w:p>
       <w:pPr>
@@ -1943,6 +2000,27 @@
           <w:lang w:val="en-US"/>
         </w:rPr>
       </w:pPr>
+      <w:r>
+        <w:rPr>
+          <w:b/>
+          <w:lang w:val="en-US"/>
+        </w:rPr>
+        <w:t xml:space="preserve">6 </w:t>
+      </w:r>
+      <w:r>
+        <w:rPr>
+          <w:b/>
+          <w:lang w:val="en-US"/>
+        </w:rPr>
+        <w:t>Explainability Analysi</w:t>
+      </w:r>
+      <w:r>
+        <w:rPr>
+          <w:b/>
+          <w:lang w:val="en-US"/>
+        </w:rPr>
+        <w:t>s</w:t>
+      </w:r>
     </w:p>
     <w:p>
       <w:pPr>
@@ -1956,34 +2034,6 @@
           <w:lang w:val="en-US"/>
         </w:rPr>
       </w:pPr>
-      <w:r>
-        <w:rPr>
-          <w:b/>
-          <w:lang w:val="en-US"/>
-        </w:rPr>
-        <w:t xml:space="preserve">7 </w:t>
-      </w:r>
-      <w:r>
-        <w:rPr>
-          <w:b/>
-          <w:lang w:val="en-US"/>
-        </w:rPr>
-        <w:t>Discussion</w:t>
-      </w:r>
-      <w:r>
-        <w:rPr>
-          <w:b/>
-          <w:lang w:val="en-US"/>
-        </w:rPr>
-        <w:t xml:space="preserve"> </w:t>
-      </w:r>
-      <w:r>
-        <w:rPr>
-          <w:b/>
-          <w:lang w:val="en-US"/>
-        </w:rPr>
-        <w:t>and Limitations</w:t>
-      </w:r>
     </w:p>
     <w:p>
       <w:pPr>
@@ -1997,6 +2047,34 @@
           <w:lang w:val="en-US"/>
         </w:rPr>
       </w:pPr>
+      <w:r>
+        <w:rPr>
+          <w:b/>
+          <w:lang w:val="en-US"/>
+        </w:rPr>
+        <w:t xml:space="preserve">7 </w:t>
+      </w:r>
+      <w:r>
+        <w:rPr>
+          <w:b/>
+          <w:lang w:val="en-US"/>
+        </w:rPr>
+        <w:t>Discussion</w:t>
+      </w:r>
+      <w:r>
+        <w:rPr>
+          <w:b/>
+          <w:lang w:val="en-US"/>
+        </w:rPr>
+        <w:t xml:space="preserve"> </w:t>
+      </w:r>
+      <w:r>
+        <w:rPr>
+          <w:b/>
+          <w:lang w:val="en-US"/>
+        </w:rPr>
+        <w:t>and Limitations</w:t>
+      </w:r>
     </w:p>
     <w:p>
       <w:pPr>
@@ -2010,20 +2088,6 @@
           <w:lang w:val="en-US"/>
         </w:rPr>
       </w:pPr>
-      <w:r>
-        <w:rPr>
-          <w:b/>
-          <w:lang w:val="en-US"/>
-        </w:rPr>
-        <w:t xml:space="preserve">8 </w:t>
-      </w:r>
-      <w:r>
-        <w:rPr>
-          <w:b/>
-          <w:lang w:val="en-US"/>
-        </w:rPr>
-        <w:t>Conclusion</w:t>
-      </w:r>
     </w:p>
     <w:p>
       <w:pPr>
@@ -2037,6 +2101,20 @@
           <w:lang w:val="en-US"/>
         </w:rPr>
       </w:pPr>
+      <w:r>
+        <w:rPr>
+          <w:b/>
+          <w:lang w:val="en-US"/>
+        </w:rPr>
+        <w:t xml:space="preserve">8 </w:t>
+      </w:r>
+      <w:r>
+        <w:rPr>
+          <w:b/>
+          <w:lang w:val="en-US"/>
+        </w:rPr>
+        <w:t>Conclusion</w:t>
+      </w:r>
     </w:p>
     <w:p>
       <w:pPr>
@@ -2059,6 +2137,19 @@
         <w:adjustRightInd w:val="0"/>
         <w:jc w:val="both"/>
         <w:rPr>
+          <w:b/>
+          <w:lang w:val="en-US"/>
+        </w:rPr>
+      </w:pPr>
+    </w:p>
+    <w:p>
+      <w:pPr>
+        <w:widowControl w:val="0"/>
+        <w:autoSpaceDE w:val="0"/>
+        <w:autoSpaceDN w:val="0"/>
+        <w:adjustRightInd w:val="0"/>
+        <w:jc w:val="both"/>
+        <w:rPr>
           <w:lang w:val="en-US"/>
         </w:rPr>
       </w:pPr>
@@ -2085,6 +2176,7 @@
           <w:b/>
           <w:lang w:val="en-US"/>
         </w:rPr>
+        <w:lastRenderedPageBreak/>
         <w:t>References</w:t>
       </w:r>
     </w:p>
@@ -2214,8 +2306,8 @@
       <w:r>
         <w:t xml:space="preserve">. </w:t>
       </w:r>
-      <w:smartTag w:uri="urn:schemas-microsoft-com:office:smarttags" w:element="place">
-        <w:smartTag w:uri="urn:schemas-microsoft-com:office:smarttags" w:element="City">
+      <w:smartTag w:uri="urn:schemas-microsoft-com:office:smarttags" w:element="City">
+        <w:smartTag w:uri="urn:schemas-microsoft-com:office:smarttags" w:element="place">
           <w:r>
             <w:t>Bucharest</w:t>
           </w:r>
@@ -2319,7 +2411,6 @@
           <w:noProof/>
           <w:lang w:val="ro-RO" w:eastAsia="ro-RO"/>
         </w:rPr>
-        <w:lastRenderedPageBreak/>
         <w:drawing>
           <wp:anchor distT="0" distB="0" distL="114300" distR="114300" simplePos="0" relativeHeight="251657728" behindDoc="0" locked="0" layoutInCell="1" allowOverlap="1" wp14:anchorId="2252EDF0" wp14:editId="627EE7ED">
             <wp:simplePos x="0" y="0"/>

</xml_diff>

<commit_message>
made some small changes
</commit_message>
<xml_diff>
--- a/doc/journal_paper.docx
+++ b/doc/journal_paper.docx
@@ -464,12 +464,6 @@
         <w:rPr>
           <w:lang w:val="en-US"/>
         </w:rPr>
-        <w:tab/>
-      </w:r>
-      <w:r>
-        <w:rPr>
-          <w:lang w:val="en-US"/>
-        </w:rPr>
         <w:t>Large language models enable the generation of structured and fluent text that can approximate human-written product reviews</w:t>
       </w:r>
       <w:r>
@@ -533,12 +527,6 @@
         <w:rPr>
           <w:lang w:val="en-US"/>
         </w:rPr>
-        <w:tab/>
-      </w:r>
-      <w:r>
-        <w:rPr>
-          <w:lang w:val="en-US"/>
-        </w:rPr>
         <w:t>Existing methods for detecting deceptive reviews are typically developed for human-generated content and rely on assumptions that do not fully apply to text produced by large language models. Due to the increased regularity and fluency of generated text, the performance of such methods may degrade in this setting</w:t>
       </w:r>
       <w:r>
@@ -602,12 +590,6 @@
         <w:rPr>
           <w:lang w:val="en-US"/>
         </w:rPr>
-        <w:tab/>
-      </w:r>
-      <w:r>
-        <w:rPr>
-          <w:lang w:val="en-US"/>
-        </w:rPr>
         <w:t>This paper proposes a practical approach for detecting AI-generated product reviews based on classical machine learning techniques. A dataset is constructed by combining real user reviews</w:t>
       </w:r>
       <w:r>
@@ -620,14 +602,14 @@
         <w:rPr>
           <w:lang w:val="en-US"/>
         </w:rPr>
-        <w:t xml:space="preserve"> with artificially generated content obtained using a large language model, followed by a preprocessing stage aimed at removing noise and standardizing the input data. The classification task is addressed using a TF-IDF representation and a linear Support Vector Machine model, selected for its simplicity and effectiveness in high-dimensional text spaces. In addition, </w:t>
+        <w:t xml:space="preserve"> with artificially generated content obtained using a large language model, followed by a preprocessing stage aimed at removing noise and standardizing the input data. The classification task is addressed using a TF-IDF representation and a linear Support Vector Machine model, selected for its simplicity and effectiveness in high-dimensional text spaces. In addition, an explainability component based on SHAP is introduced to analyze the contribution of </w:t>
       </w:r>
       <w:r>
         <w:rPr>
           <w:lang w:val="en-US"/>
         </w:rPr>
         <w:lastRenderedPageBreak/>
-        <w:t xml:space="preserve">an explainability component based on SHAP is introduced to analyze the contribution of individual linguistic features to </w:t>
+        <w:t xml:space="preserve">individual linguistic features to </w:t>
       </w:r>
       <w:r>
         <w:rPr>
@@ -690,13 +672,6 @@
       </w:pPr>
       <w:r>
         <w:rPr>
-          <w:b/>
-          <w:lang w:val="en-US"/>
-        </w:rPr>
-        <w:tab/>
-      </w:r>
-      <w:r>
-        <w:rPr>
           <w:bCs w:val="0"/>
           <w:lang w:val="en-US"/>
         </w:rPr>
@@ -744,15 +719,13 @@
         </w:rPr>
         <w:t xml:space="preserve">. This perspective explains the increasing interest in methods for </w:t>
       </w:r>
-      <w:proofErr w:type="spellStart"/>
-      <w:r>
-        <w:rPr>
-          <w:bCs w:val="0"/>
-          <w:lang w:val="en-US"/>
-        </w:rPr>
-        <w:t>analysing</w:t>
-      </w:r>
-      <w:proofErr w:type="spellEnd"/>
+      <w:r>
+        <w:rPr>
+          <w:bCs w:val="0"/>
+          <w:lang w:val="en-US"/>
+        </w:rPr>
+        <w:t>analyzing</w:t>
+      </w:r>
       <w:r>
         <w:rPr>
           <w:bCs w:val="0"/>
@@ -778,7 +751,6 @@
     <w:p>
       <w:pPr>
         <w:widowControl w:val="0"/>
-        <w:ind w:firstLine="720"/>
         <w:jc w:val="both"/>
         <w:rPr>
           <w:bCs w:val="0"/>
@@ -852,7 +824,6 @@
     <w:p>
       <w:pPr>
         <w:widowControl w:val="0"/>
-        <w:ind w:firstLine="720"/>
         <w:jc w:val="both"/>
         <w:rPr>
           <w:bCs w:val="0"/>
@@ -979,7 +950,6 @@
         <w:autoSpaceDE w:val="0"/>
         <w:autoSpaceDN w:val="0"/>
         <w:adjustRightInd w:val="0"/>
-        <w:ind w:firstLine="720"/>
         <w:jc w:val="both"/>
         <w:rPr>
           <w:bCs w:val="0"/>
@@ -991,24 +961,31 @@
           <w:bCs w:val="0"/>
           <w:lang w:val="en-US"/>
         </w:rPr>
+        <w:t xml:space="preserve">The </w:t>
+      </w:r>
+      <w:proofErr w:type="gramStart"/>
+      <w:r>
+        <w:rPr>
+          <w:bCs w:val="0"/>
+          <w:lang w:val="en-US"/>
+        </w:rPr>
+        <w:t>dataset</w:t>
+      </w:r>
+      <w:proofErr w:type="gramEnd"/>
+      <w:r>
+        <w:rPr>
+          <w:bCs w:val="0"/>
+          <w:lang w:val="en-US"/>
+        </w:rPr>
+        <w:t xml:space="preserve"> used in this study consists of both real user-generated product reviews and </w:t>
+      </w:r>
+      <w:r>
+        <w:rPr>
+          <w:bCs w:val="0"/>
+          <w:lang w:val="en-US"/>
+        </w:rPr>
         <w:lastRenderedPageBreak/>
-        <w:t xml:space="preserve">The </w:t>
-      </w:r>
-      <w:proofErr w:type="gramStart"/>
-      <w:r>
-        <w:rPr>
-          <w:bCs w:val="0"/>
-          <w:lang w:val="en-US"/>
-        </w:rPr>
-        <w:t>dataset</w:t>
-      </w:r>
-      <w:proofErr w:type="gramEnd"/>
-      <w:r>
-        <w:rPr>
-          <w:bCs w:val="0"/>
-          <w:lang w:val="en-US"/>
-        </w:rPr>
-        <w:t xml:space="preserve"> used in this study consists of both real user-generated product reviews and artificially generated content. The real reviews were collected from an existing dataset</w:t>
+        <w:t>artificially generated content. The real reviews were collected from an existing dataset</w:t>
       </w:r>
       <w:r>
         <w:rPr>
@@ -1031,7 +1008,6 @@
         <w:autoSpaceDE w:val="0"/>
         <w:autoSpaceDN w:val="0"/>
         <w:adjustRightInd w:val="0"/>
-        <w:ind w:firstLine="720"/>
         <w:jc w:val="both"/>
         <w:rPr>
           <w:bCs w:val="0"/>
@@ -1043,7 +1019,23 @@
           <w:bCs w:val="0"/>
           <w:lang w:val="en-US"/>
         </w:rPr>
-        <w:t>Artificial reviews were generated using a large language model (Gemma 2B)</w:t>
+        <w:t>Artificial reviews were generated using a large language model (</w:t>
+      </w:r>
+      <w:r>
+        <w:rPr>
+          <w:bCs w:val="0"/>
+          <w:i/>
+          <w:iCs/>
+          <w:lang w:val="en-US"/>
+        </w:rPr>
+        <w:t>Gemma 2B</w:t>
+      </w:r>
+      <w:r>
+        <w:rPr>
+          <w:bCs w:val="0"/>
+          <w:lang w:val="en-US"/>
+        </w:rPr>
+        <w:t>)</w:t>
       </w:r>
       <w:r>
         <w:rPr>
@@ -1096,7 +1088,6 @@
         <w:autoSpaceDE w:val="0"/>
         <w:autoSpaceDN w:val="0"/>
         <w:adjustRightInd w:val="0"/>
-        <w:ind w:firstLine="720"/>
         <w:jc w:val="both"/>
         <w:rPr>
           <w:bCs w:val="0"/>
@@ -1108,7 +1099,37 @@
           <w:bCs w:val="0"/>
           <w:lang w:val="en-US"/>
         </w:rPr>
-        <w:t>The final dataset was obtained by combining the two sources into a unified collection of labeled samples, where real reviews were assigned label 0 and generated reviews label 1. The resulting dataset contains 5,893 samples, including 3,000 real reviews and 2,893 AI-generated reviews.</w:t>
+        <w:t xml:space="preserve">The final dataset was obtained by combining the two sources into a unified collection of labeled samples, where real reviews were assigned label 0 and generated reviews label 1. The resulting </w:t>
+      </w:r>
+      <w:proofErr w:type="gramStart"/>
+      <w:r>
+        <w:rPr>
+          <w:bCs w:val="0"/>
+          <w:lang w:val="en-US"/>
+        </w:rPr>
+        <w:t>dataset</w:t>
+      </w:r>
+      <w:proofErr w:type="gramEnd"/>
+      <w:r>
+        <w:rPr>
+          <w:bCs w:val="0"/>
+          <w:lang w:val="en-US"/>
+        </w:rPr>
+        <w:t xml:space="preserve"> </w:t>
+      </w:r>
+      <w:r>
+        <w:rPr>
+          <w:bCs w:val="0"/>
+          <w:lang w:val="en-US"/>
+        </w:rPr>
+        <w:t xml:space="preserve">(Table 1) </w:t>
+      </w:r>
+      <w:r>
+        <w:rPr>
+          <w:bCs w:val="0"/>
+          <w:lang w:val="en-US"/>
+        </w:rPr>
+        <w:t>contains 5,893 samples, including 3,000 real reviews and 2,893 AI-generated reviews.</w:t>
       </w:r>
     </w:p>
     <w:p>
@@ -1387,7 +1408,6 @@
         <w:autoSpaceDE w:val="0"/>
         <w:autoSpaceDN w:val="0"/>
         <w:adjustRightInd w:val="0"/>
-        <w:ind w:firstLine="720"/>
         <w:jc w:val="both"/>
         <w:rPr>
           <w:bCs w:val="0"/>
@@ -1443,11 +1463,27 @@
         <w:rPr>
           <w:lang w:val="en-US"/>
         </w:rPr>
-        <w:t>A preprocessing stage was applied to standardize the textual data and remove artifacts that could introduce bias in the classification process [5]. HTML elements and residual tokens such as “</w:t>
+        <w:t xml:space="preserve">A preprocessing stage was applied to standardize the textual data and remove artifacts that could introduce bias in the classification process [5]. </w:t>
+      </w:r>
+      <w:r>
+        <w:rPr>
+          <w:i/>
+          <w:iCs/>
+          <w:lang w:val="en-US"/>
+        </w:rPr>
+        <w:t>HTML</w:t>
+      </w:r>
+      <w:r>
+        <w:rPr>
+          <w:lang w:val="en-US"/>
+        </w:rPr>
+        <w:t xml:space="preserve"> elements and residual tokens such as </w:t>
       </w:r>
       <w:proofErr w:type="spellStart"/>
       <w:r>
         <w:rPr>
+          <w:i/>
+          <w:iCs/>
           <w:lang w:val="en-US"/>
         </w:rPr>
         <w:t>br</w:t>
@@ -1457,7 +1493,7 @@
         <w:rPr>
           <w:lang w:val="en-US"/>
         </w:rPr>
-        <w:t>” were eliminated, as they do not represent meaningful linguistic information and may act as unintended discriminative features. Duplicate entries were removed to avoid redundancy, and reviews with extremely short or inconsistent content were filtered out. Basic normalization steps were also applied to ensure a consistent format across all samples.</w:t>
+        <w:t xml:space="preserve"> were eliminated, as they do not represent meaningful linguistic information and may act as unintended discriminative features. Duplicate entries were removed to avoid redundancy, and reviews with extremely short or inconsistent content were filtered out. Basic normalization steps were also applied to ensure a consistent format across all samples.</w:t>
       </w:r>
     </w:p>
     <w:p>
@@ -1976,7 +2012,6 @@
         <w:autoSpaceDE w:val="0"/>
         <w:autoSpaceDN w:val="0"/>
         <w:adjustRightInd w:val="0"/>
-        <w:ind w:firstLine="720"/>
         <w:jc w:val="both"/>
         <w:rPr>
           <w:bCs w:val="0"/>
@@ -1988,7 +2023,35 @@
           <w:bCs w:val="0"/>
           <w:lang w:val="en-US"/>
         </w:rPr>
-        <w:t>The textual data was transformed into numerical representations using two feature extraction strategies. The first strategy was based on simple surface features, intended to capture general structural characteristics of the reviews, such as text length, punctuation-related information, and other basic stylistic indicators. This representation was used for the baseline configuration.</w:t>
+        <w:t>The textual data was transformed into numerical representations using two feature extraction strategies</w:t>
+      </w:r>
+      <w:r>
+        <w:rPr>
+          <w:bCs w:val="0"/>
+          <w:lang w:val="en-US"/>
+        </w:rPr>
+        <w:t xml:space="preserve"> (Fig. 1)</w:t>
+      </w:r>
+      <w:r>
+        <w:rPr>
+          <w:bCs w:val="0"/>
+          <w:lang w:val="en-US"/>
+        </w:rPr>
+        <w:t>. The first strategy was based on simple surface features</w:t>
+      </w:r>
+      <w:r>
+        <w:rPr>
+          <w:bCs w:val="0"/>
+          <w:lang w:val="en-US"/>
+        </w:rPr>
+        <w:t xml:space="preserve"> (Table 3)</w:t>
+      </w:r>
+      <w:r>
+        <w:rPr>
+          <w:bCs w:val="0"/>
+          <w:lang w:val="en-US"/>
+        </w:rPr>
+        <w:t>, intended to capture general structural characteristics of the reviews, such as text length, punctuation-related information, and other basic stylistic indicators. This representation was used for the baseline configuration.</w:t>
       </w:r>
     </w:p>
     <w:p>
@@ -2008,7 +2071,6 @@
           <w:b/>
           <w:lang w:val="en-US"/>
         </w:rPr>
-        <w:lastRenderedPageBreak/>
         <w:t xml:space="preserve">Table </w:t>
       </w:r>
       <w:r>
@@ -2073,6 +2135,7 @@
                 <w:b/>
                 <w:lang w:val="en-US"/>
               </w:rPr>
+              <w:lastRenderedPageBreak/>
               <w:t>Feature</w:t>
             </w:r>
           </w:p>
@@ -2725,7 +2788,6 @@
         <w:autoSpaceDE w:val="0"/>
         <w:autoSpaceDN w:val="0"/>
         <w:adjustRightInd w:val="0"/>
-        <w:ind w:firstLine="720"/>
         <w:jc w:val="both"/>
         <w:rPr>
           <w:bCs w:val="0"/>
@@ -2737,7 +2799,23 @@
           <w:bCs w:val="0"/>
           <w:lang w:val="en-US"/>
         </w:rPr>
-        <w:t>The second strategy was based on the Term Frequency–Inverse Document Frequency (TF-IDF) approach</w:t>
+        <w:t xml:space="preserve">The second strategy was based on the </w:t>
+      </w:r>
+      <w:r>
+        <w:rPr>
+          <w:bCs w:val="0"/>
+          <w:i/>
+          <w:iCs/>
+          <w:lang w:val="en-US"/>
+        </w:rPr>
+        <w:t>Term Frequency–Inverse Document Frequency (TF-IDF)</w:t>
+      </w:r>
+      <w:r>
+        <w:rPr>
+          <w:bCs w:val="0"/>
+          <w:lang w:val="en-US"/>
+        </w:rPr>
+        <w:t xml:space="preserve"> approach</w:t>
       </w:r>
       <w:r>
         <w:rPr>
@@ -2765,7 +2843,23 @@
           <w:bCs w:val="0"/>
           <w:lang w:val="en-US"/>
         </w:rPr>
-        <w:t>The TF-IDF weight of a term</w:t>
+        <w:t xml:space="preserve">The </w:t>
+      </w:r>
+      <w:r>
+        <w:rPr>
+          <w:bCs w:val="0"/>
+          <w:i/>
+          <w:iCs/>
+          <w:lang w:val="en-US"/>
+        </w:rPr>
+        <w:t>TF-IDF</w:t>
+      </w:r>
+      <w:r>
+        <w:rPr>
+          <w:bCs w:val="0"/>
+          <w:lang w:val="en-US"/>
+        </w:rPr>
+        <w:t xml:space="preserve"> weight of a term</w:t>
       </w:r>
       <w:r>
         <w:rPr>
@@ -3109,15 +3203,33 @@
           <w:bCs w:val="0"/>
           <w:lang w:val="en-US"/>
         </w:rPr>
-        <w:t>The TF</w:t>
+        <w:t xml:space="preserve">The </w:t>
+      </w:r>
+      <w:r>
+        <w:rPr>
+          <w:bCs w:val="0"/>
+          <w:i/>
+          <w:iCs/>
+          <w:lang w:val="en-US"/>
+        </w:rPr>
+        <w:t>TF</w:t>
       </w:r>
       <w:proofErr w:type="gramEnd"/>
       <w:r>
         <w:rPr>
           <w:bCs w:val="0"/>
-          <w:lang w:val="en-US"/>
-        </w:rPr>
-        <w:t>-IDF representation reduces the influence of frequently occurring terms that carry limited information, while emphasizing terms that are more specific to individual reviews</w:t>
+          <w:i/>
+          <w:iCs/>
+          <w:lang w:val="en-US"/>
+        </w:rPr>
+        <w:t>-IDF</w:t>
+      </w:r>
+      <w:r>
+        <w:rPr>
+          <w:bCs w:val="0"/>
+          <w:lang w:val="en-US"/>
+        </w:rPr>
+        <w:t xml:space="preserve"> representation reduces the influence of frequently occurring terms that carry limited information, while emphasizing terms that are more specific to individual reviews</w:t>
       </w:r>
       <w:r>
         <w:rPr>
@@ -3188,7 +3300,23 @@
           <w:bCs w:val="0"/>
           <w:lang w:val="en-US"/>
         </w:rPr>
-        <w:t>The TF-IDF representation was selected due to its simplicity and effectiveness in text classification tasks</w:t>
+        <w:t xml:space="preserve">The </w:t>
+      </w:r>
+      <w:r>
+        <w:rPr>
+          <w:bCs w:val="0"/>
+          <w:i/>
+          <w:iCs/>
+          <w:lang w:val="en-US"/>
+        </w:rPr>
+        <w:t>TF-IDF</w:t>
+      </w:r>
+      <w:r>
+        <w:rPr>
+          <w:bCs w:val="0"/>
+          <w:lang w:val="en-US"/>
+        </w:rPr>
+        <w:t xml:space="preserve"> representation was selected due to its simplicity and effectiveness in text classification tasks</w:t>
       </w:r>
       <w:r>
         <w:rPr>
@@ -3391,7 +3519,23 @@
           <w:bCs w:val="0"/>
           <w:lang w:val="en-US"/>
         </w:rPr>
-        <w:t>. The baseline configuration used Logistic Regression applied to the surface features described above. This setting was intended to provide a reference point for evaluating the contribution of richer lexical representations.</w:t>
+        <w:t xml:space="preserve">. The baseline configuration used </w:t>
+      </w:r>
+      <w:r>
+        <w:rPr>
+          <w:bCs w:val="0"/>
+          <w:i/>
+          <w:iCs/>
+          <w:lang w:val="en-US"/>
+        </w:rPr>
+        <w:t>Logistic Regression</w:t>
+      </w:r>
+      <w:r>
+        <w:rPr>
+          <w:bCs w:val="0"/>
+          <w:lang w:val="en-US"/>
+        </w:rPr>
+        <w:t xml:space="preserve"> applied to the surface features described above. This setting was intended to provide a reference point for evaluating the contribution of richer lexical representations.</w:t>
       </w:r>
     </w:p>
     <w:p>
@@ -3411,15 +3555,39 @@
           <w:bCs w:val="0"/>
           <w:lang w:val="en-US"/>
         </w:rPr>
-        <w:t xml:space="preserve">A second configuration employed Logistic Regression on top of the TF-IDF representation. This experiment was introduced to assess the effect of lexical information independently of the final classifier and to measure the improvement obtained when moving from surface-level </w:t>
-      </w:r>
-      <w:r>
-        <w:rPr>
-          <w:bCs w:val="0"/>
-          <w:lang w:val="en-US"/>
-        </w:rPr>
-        <w:lastRenderedPageBreak/>
-        <w:t>descriptors to sparse term-based features.</w:t>
+        <w:t xml:space="preserve">A second configuration employed </w:t>
+      </w:r>
+      <w:r>
+        <w:rPr>
+          <w:bCs w:val="0"/>
+          <w:i/>
+          <w:iCs/>
+          <w:lang w:val="en-US"/>
+        </w:rPr>
+        <w:t>Logistic Regression</w:t>
+      </w:r>
+      <w:r>
+        <w:rPr>
+          <w:bCs w:val="0"/>
+          <w:lang w:val="en-US"/>
+        </w:rPr>
+        <w:t xml:space="preserve"> on top of the </w:t>
+      </w:r>
+      <w:r>
+        <w:rPr>
+          <w:bCs w:val="0"/>
+          <w:i/>
+          <w:iCs/>
+          <w:lang w:val="en-US"/>
+        </w:rPr>
+        <w:t>TF-IDF</w:t>
+      </w:r>
+      <w:r>
+        <w:rPr>
+          <w:bCs w:val="0"/>
+          <w:lang w:val="en-US"/>
+        </w:rPr>
+        <w:t xml:space="preserve"> representation. This experiment was introduced to assess the effect of lexical information independently of the final classifier and to measure the improvement obtained when moving from surface-level descriptors to sparse term-based features.</w:t>
       </w:r>
     </w:p>
     <w:p>
@@ -3439,7 +3607,56 @@
           <w:bCs w:val="0"/>
           <w:lang w:val="en-US"/>
         </w:rPr>
-        <w:t>The third configuration corresponds to the main model of the proposed framework. In this case, a linear Support Vector Machine (SVM) classifier was applied to the same TF-IDF feature space. This model was selected due to its ability to effectively handle high-dimensional sparse data, which is characteristic of text-based representations, as well as its strong performance in similar classification tasks</w:t>
+        <w:lastRenderedPageBreak/>
+        <w:t xml:space="preserve">The third configuration corresponds to the main model of the proposed framework. In this case, a </w:t>
+      </w:r>
+      <w:r>
+        <w:rPr>
+          <w:bCs w:val="0"/>
+          <w:i/>
+          <w:iCs/>
+          <w:lang w:val="en-US"/>
+        </w:rPr>
+        <w:t>linear</w:t>
+      </w:r>
+      <w:r>
+        <w:rPr>
+          <w:bCs w:val="0"/>
+          <w:lang w:val="en-US"/>
+        </w:rPr>
+        <w:t xml:space="preserve"> </w:t>
+      </w:r>
+      <w:r>
+        <w:rPr>
+          <w:bCs w:val="0"/>
+          <w:i/>
+          <w:iCs/>
+          <w:lang w:val="en-US"/>
+        </w:rPr>
+        <w:t>Support Vector Machine (SVM)</w:t>
+      </w:r>
+      <w:r>
+        <w:rPr>
+          <w:bCs w:val="0"/>
+          <w:lang w:val="en-US"/>
+        </w:rPr>
+        <w:t xml:space="preserve"> classifier was applied to the same </w:t>
+      </w:r>
+      <w:r>
+        <w:rPr>
+          <w:bCs w:val="0"/>
+          <w:i/>
+          <w:iCs/>
+          <w:lang w:val="en-US"/>
+        </w:rPr>
+        <w:t>TF-IDF</w:t>
+      </w:r>
+      <w:r>
+        <w:rPr>
+          <w:bCs w:val="0"/>
+          <w:lang w:val="en-US"/>
+        </w:rPr>
+        <w:t xml:space="preserve"> feature space. This model was selected due to its ability to effectively handle high-dimensional sparse data, which is characteristic of text-based representations, as well as its strong performance in similar classification tasks</w:t>
       </w:r>
       <w:r>
         <w:rPr>
@@ -3489,7 +3706,16 @@
           <w:bCs w:val="0"/>
           <w:lang w:val="en-US"/>
         </w:rPr>
-        <w:t xml:space="preserve"> evaluate the generalization capability of the models. Standard classification metrics were used to assess performance. An explainability analysis was further conducted using SHAP</w:t>
+        <w:t xml:space="preserve"> evaluate the generalization capability of the models. Standard classification metrics were used to assess performance. An explainability analysis was further conducted using </w:t>
+      </w:r>
+      <w:r>
+        <w:rPr>
+          <w:bCs w:val="0"/>
+          <w:i/>
+          <w:iCs/>
+          <w:lang w:val="en-US"/>
+        </w:rPr>
+        <w:t>SHAP</w:t>
       </w:r>
       <w:r>
         <w:rPr>
@@ -3508,6 +3734,8 @@
       <w:r>
         <w:rPr>
           <w:bCs w:val="0"/>
+          <w:i/>
+          <w:iCs/>
           <w:lang w:val="en-US"/>
         </w:rPr>
         <w:t>SVM</w:t>
@@ -3517,7 +3745,23 @@
           <w:bCs w:val="0"/>
           <w:lang w:val="en-US"/>
         </w:rPr>
-        <w:t xml:space="preserve"> model trained on TF-IDF features, to investigate the contribution of individual linguistic features to the prediction process.</w:t>
+        <w:t xml:space="preserve"> model trained on </w:t>
+      </w:r>
+      <w:r>
+        <w:rPr>
+          <w:bCs w:val="0"/>
+          <w:i/>
+          <w:iCs/>
+          <w:lang w:val="en-US"/>
+        </w:rPr>
+        <w:t>TF-IDF</w:t>
+      </w:r>
+      <w:r>
+        <w:rPr>
+          <w:bCs w:val="0"/>
+          <w:lang w:val="en-US"/>
+        </w:rPr>
+        <w:t xml:space="preserve"> features, to investigate the contribution of individual linguistic features to the prediction process.</w:t>
       </w:r>
     </w:p>
     <w:p>
@@ -3610,7 +3854,6 @@
         <w:autoSpaceDE w:val="0"/>
         <w:autoSpaceDN w:val="0"/>
         <w:adjustRightInd w:val="0"/>
-        <w:ind w:firstLine="720"/>
         <w:jc w:val="both"/>
         <w:rPr>
           <w:bCs w:val="0"/>
@@ -3637,169 +3880,6 @@
           <w:lang w:val="en-US"/>
         </w:rPr>
         <w:t>The dataset was divided into training and testing subsets using a stratified 80/20 split, to preserve the class proportions in both partitions and to ensure a fair evaluation of the classification models. Three experimental settings were considered.</w:t>
-      </w:r>
-    </w:p>
-    <w:p>
-      <w:pPr>
-        <w:widowControl w:val="0"/>
-        <w:autoSpaceDE w:val="0"/>
-        <w:autoSpaceDN w:val="0"/>
-        <w:adjustRightInd w:val="0"/>
-        <w:ind w:firstLine="720"/>
-        <w:jc w:val="both"/>
-        <w:rPr>
-          <w:bCs w:val="0"/>
-          <w:lang w:val="en-US"/>
-        </w:rPr>
-      </w:pPr>
-      <w:r>
-        <w:rPr>
-          <w:bCs w:val="0"/>
-          <w:lang w:val="en-US"/>
-        </w:rPr>
-        <w:t xml:space="preserve">The first </w:t>
-      </w:r>
-      <w:r>
-        <w:rPr>
-          <w:bCs w:val="0"/>
-          <w:lang w:val="en-US"/>
-        </w:rPr>
-        <w:t>experiment</w:t>
-      </w:r>
-      <w:r>
-        <w:rPr>
-          <w:bCs w:val="0"/>
-          <w:lang w:val="en-US"/>
-        </w:rPr>
-        <w:t xml:space="preserve"> corresponds to a baseline model based on simple surface features extracted from the review text. These features capture general structural properties, such as text length, punctuation-related information, and other basic stylistic indicators. The baseline classifier was implemented using Logistic Regression and was intended to provide a reference point for evaluating the contribution of richer lexical representations.</w:t>
-      </w:r>
-    </w:p>
-    <w:p>
-      <w:pPr>
-        <w:widowControl w:val="0"/>
-        <w:autoSpaceDE w:val="0"/>
-        <w:autoSpaceDN w:val="0"/>
-        <w:adjustRightInd w:val="0"/>
-        <w:ind w:firstLine="720"/>
-        <w:jc w:val="both"/>
-        <w:rPr>
-          <w:bCs w:val="0"/>
-          <w:lang w:val="en-US"/>
-        </w:rPr>
-      </w:pPr>
-      <w:r>
-        <w:rPr>
-          <w:bCs w:val="0"/>
-          <w:lang w:val="en-US"/>
-        </w:rPr>
-        <w:t xml:space="preserve">The second </w:t>
-      </w:r>
-      <w:r>
-        <w:rPr>
-          <w:bCs w:val="0"/>
-          <w:lang w:val="en-US"/>
-        </w:rPr>
-        <w:t>experiment</w:t>
-      </w:r>
-      <w:r>
-        <w:rPr>
-          <w:bCs w:val="0"/>
-          <w:lang w:val="en-US"/>
-        </w:rPr>
-        <w:t xml:space="preserve"> uses a TF-IDF representation computed over unigrams and bigrams, combined with a Logistic Regression classifier. This experiment was introduced </w:t>
-      </w:r>
-      <w:proofErr w:type="gramStart"/>
-      <w:r>
-        <w:rPr>
-          <w:bCs w:val="0"/>
-          <w:lang w:val="en-US"/>
-        </w:rPr>
-        <w:t>in order to</w:t>
-      </w:r>
-      <w:proofErr w:type="gramEnd"/>
-      <w:r>
-        <w:rPr>
-          <w:bCs w:val="0"/>
-          <w:lang w:val="en-US"/>
-        </w:rPr>
-        <w:t xml:space="preserve"> evaluate the effect of lexical information independently of the final model choice and to measure the improvement obtained when moving from surface-level features to a sparse term-based representation.</w:t>
-      </w:r>
-    </w:p>
-    <w:p>
-      <w:pPr>
-        <w:widowControl w:val="0"/>
-        <w:autoSpaceDE w:val="0"/>
-        <w:autoSpaceDN w:val="0"/>
-        <w:adjustRightInd w:val="0"/>
-        <w:ind w:firstLine="720"/>
-        <w:jc w:val="both"/>
-        <w:rPr>
-          <w:bCs w:val="0"/>
-          <w:lang w:val="en-US"/>
-        </w:rPr>
-      </w:pPr>
-      <w:r>
-        <w:rPr>
-          <w:bCs w:val="0"/>
-          <w:lang w:val="en-US"/>
-        </w:rPr>
-        <w:t xml:space="preserve">The third </w:t>
-      </w:r>
-      <w:r>
-        <w:rPr>
-          <w:bCs w:val="0"/>
-          <w:lang w:val="en-US"/>
-        </w:rPr>
-        <w:t xml:space="preserve">experiment </w:t>
-      </w:r>
-      <w:r>
-        <w:rPr>
-          <w:bCs w:val="0"/>
-          <w:lang w:val="en-US"/>
-        </w:rPr>
-        <w:t>corresponds</w:t>
-      </w:r>
-      <w:r>
-        <w:rPr>
-          <w:bCs w:val="0"/>
-          <w:lang w:val="en-US"/>
-        </w:rPr>
-        <w:t xml:space="preserve"> to the main configuration of the proposed framework. In this case, the same TF-IDF representation was used together with a linear Support Vector Machine classifier. This model was selected as the main classifier due to its suitability for high-dimensional sparse data and its strong performance in text classification tasks.</w:t>
-      </w:r>
-    </w:p>
-    <w:p>
-      <w:pPr>
-        <w:widowControl w:val="0"/>
-        <w:autoSpaceDE w:val="0"/>
-        <w:autoSpaceDN w:val="0"/>
-        <w:adjustRightInd w:val="0"/>
-        <w:ind w:firstLine="720"/>
-        <w:jc w:val="both"/>
-        <w:rPr>
-          <w:bCs w:val="0"/>
-          <w:lang w:val="en-US"/>
-        </w:rPr>
-      </w:pPr>
-      <w:r>
-        <w:rPr>
-          <w:bCs w:val="0"/>
-          <w:lang w:val="en-US"/>
-        </w:rPr>
-        <w:t>The evaluated models were assessed using standard classification metrics, namely accuracy, precision, recall, and F1-score</w:t>
-      </w:r>
-      <w:r>
-        <w:rPr>
-          <w:bCs w:val="0"/>
-          <w:lang w:val="en-US"/>
-        </w:rPr>
-        <w:t xml:space="preserve"> [25]</w:t>
-      </w:r>
-      <w:r>
-        <w:rPr>
-          <w:bCs w:val="0"/>
-          <w:lang w:val="en-US"/>
-        </w:rPr>
-        <w:t>. In addition, the confusion matrix of the best-performing model was analyzed to examine the distribution of correct and incorrect predictions across the two classes.</w:t>
       </w:r>
     </w:p>
     <w:p>
@@ -3814,6 +3894,43 @@
           <w:lang w:val="en-US"/>
         </w:rPr>
       </w:pPr>
+      <w:r>
+        <w:rPr>
+          <w:bCs w:val="0"/>
+          <w:lang w:val="en-US"/>
+        </w:rPr>
+        <w:t xml:space="preserve">The first </w:t>
+      </w:r>
+      <w:r>
+        <w:rPr>
+          <w:bCs w:val="0"/>
+          <w:lang w:val="en-US"/>
+        </w:rPr>
+        <w:t>experiment</w:t>
+      </w:r>
+      <w:r>
+        <w:rPr>
+          <w:bCs w:val="0"/>
+          <w:lang w:val="en-US"/>
+        </w:rPr>
+        <w:t xml:space="preserve"> corresponds to a baseline model based on simple surface features extracted from the review text. These features capture general structural properties, such as text length, punctuation-related information, and other basic stylistic indicators. The baseline classifier was implemented using </w:t>
+      </w:r>
+      <w:r>
+        <w:rPr>
+          <w:bCs w:val="0"/>
+          <w:i/>
+          <w:iCs/>
+          <w:lang w:val="en-US"/>
+        </w:rPr>
+        <w:t>Logistic Regression</w:t>
+      </w:r>
+      <w:r>
+        <w:rPr>
+          <w:bCs w:val="0"/>
+          <w:lang w:val="en-US"/>
+        </w:rPr>
+        <w:t xml:space="preserve"> and was intended to provide a reference point for evaluating the contribution of richer lexical representations.</w:t>
+      </w:r>
     </w:p>
     <w:p>
       <w:pPr>
@@ -3823,23 +3940,78 @@
         <w:adjustRightInd w:val="0"/>
         <w:jc w:val="both"/>
         <w:rPr>
-          <w:b/>
-          <w:lang w:val="en-US"/>
-        </w:rPr>
-      </w:pPr>
-      <w:r>
-        <w:rPr>
-          <w:b/>
-          <w:lang w:val="en-US"/>
-        </w:rPr>
-        <w:t xml:space="preserve">5.2 </w:t>
-      </w:r>
-      <w:r>
-        <w:rPr>
-          <w:b/>
-          <w:lang w:val="en-US"/>
-        </w:rPr>
-        <w:t>Results</w:t>
+          <w:bCs w:val="0"/>
+          <w:lang w:val="en-US"/>
+        </w:rPr>
+      </w:pPr>
+      <w:r>
+        <w:rPr>
+          <w:bCs w:val="0"/>
+          <w:lang w:val="en-US"/>
+        </w:rPr>
+        <w:t xml:space="preserve">The second </w:t>
+      </w:r>
+      <w:r>
+        <w:rPr>
+          <w:bCs w:val="0"/>
+          <w:lang w:val="en-US"/>
+        </w:rPr>
+        <w:t>experiment</w:t>
+      </w:r>
+      <w:r>
+        <w:rPr>
+          <w:bCs w:val="0"/>
+          <w:lang w:val="en-US"/>
+        </w:rPr>
+        <w:t xml:space="preserve"> uses a </w:t>
+      </w:r>
+      <w:r>
+        <w:rPr>
+          <w:bCs w:val="0"/>
+          <w:i/>
+          <w:iCs/>
+          <w:lang w:val="en-US"/>
+        </w:rPr>
+        <w:t>TF-IDF</w:t>
+      </w:r>
+      <w:r>
+        <w:rPr>
+          <w:bCs w:val="0"/>
+          <w:lang w:val="en-US"/>
+        </w:rPr>
+        <w:t xml:space="preserve"> representation computed over unigrams and bigrams, combined with a </w:t>
+      </w:r>
+      <w:r>
+        <w:rPr>
+          <w:bCs w:val="0"/>
+          <w:i/>
+          <w:iCs/>
+          <w:lang w:val="en-US"/>
+        </w:rPr>
+        <w:t>Logistic Regression</w:t>
+      </w:r>
+      <w:r>
+        <w:rPr>
+          <w:bCs w:val="0"/>
+          <w:lang w:val="en-US"/>
+        </w:rPr>
+        <w:t xml:space="preserve"> classifier. This experiment was introduced </w:t>
+      </w:r>
+      <w:proofErr w:type="gramStart"/>
+      <w:r>
+        <w:rPr>
+          <w:bCs w:val="0"/>
+          <w:lang w:val="en-US"/>
+        </w:rPr>
+        <w:t>in order to</w:t>
+      </w:r>
+      <w:proofErr w:type="gramEnd"/>
+      <w:r>
+        <w:rPr>
+          <w:bCs w:val="0"/>
+          <w:lang w:val="en-US"/>
+        </w:rPr>
+        <w:t xml:space="preserve"> evaluate the effect of lexical information independently of the final model choice and to measure the improvement obtained when moving from surface-level features to a sparse term-based representation.</w:t>
       </w:r>
     </w:p>
     <w:p>
@@ -3859,21 +4031,76 @@
           <w:bCs w:val="0"/>
           <w:lang w:val="en-US"/>
         </w:rPr>
-        <w:t>The classification results obtained for the three experiment</w:t>
-      </w:r>
-      <w:r>
-        <w:rPr>
-          <w:bCs w:val="0"/>
-          <w:lang w:val="en-US"/>
-        </w:rPr>
-        <w:t xml:space="preserve">s </w:t>
-      </w:r>
-      <w:r>
-        <w:rPr>
-          <w:bCs w:val="0"/>
-          <w:lang w:val="en-US"/>
-        </w:rPr>
-        <w:t>are summarized in Table 2.</w:t>
+        <w:t xml:space="preserve">The third </w:t>
+      </w:r>
+      <w:r>
+        <w:rPr>
+          <w:bCs w:val="0"/>
+          <w:lang w:val="en-US"/>
+        </w:rPr>
+        <w:t xml:space="preserve">experiment </w:t>
+      </w:r>
+      <w:r>
+        <w:rPr>
+          <w:bCs w:val="0"/>
+          <w:lang w:val="en-US"/>
+        </w:rPr>
+        <w:t>corresponds</w:t>
+      </w:r>
+      <w:r>
+        <w:rPr>
+          <w:bCs w:val="0"/>
+          <w:lang w:val="en-US"/>
+        </w:rPr>
+        <w:t xml:space="preserve"> to the main configuration of the proposed framework. In this case, the same </w:t>
+      </w:r>
+      <w:r>
+        <w:rPr>
+          <w:bCs w:val="0"/>
+          <w:i/>
+          <w:iCs/>
+          <w:lang w:val="en-US"/>
+        </w:rPr>
+        <w:t>TF-IDF</w:t>
+      </w:r>
+      <w:r>
+        <w:rPr>
+          <w:bCs w:val="0"/>
+          <w:lang w:val="en-US"/>
+        </w:rPr>
+        <w:t xml:space="preserve"> representation was used together with a </w:t>
+      </w:r>
+      <w:r>
+        <w:rPr>
+          <w:bCs w:val="0"/>
+          <w:i/>
+          <w:iCs/>
+          <w:lang w:val="en-US"/>
+        </w:rPr>
+        <w:t>linear</w:t>
+      </w:r>
+      <w:r>
+        <w:rPr>
+          <w:bCs w:val="0"/>
+          <w:lang w:val="en-US"/>
+        </w:rPr>
+        <w:t xml:space="preserve"> </w:t>
+      </w:r>
+      <w:r>
+        <w:rPr>
+          <w:bCs w:val="0"/>
+          <w:i/>
+          <w:iCs/>
+          <w:lang w:val="en-US"/>
+        </w:rPr>
+        <w:t>Support Vector Machine</w:t>
+      </w:r>
+      <w:r>
+        <w:rPr>
+          <w:bCs w:val="0"/>
+          <w:lang w:val="en-US"/>
+        </w:rPr>
+        <w:t xml:space="preserve"> classifier. This model was selected as the main classifier due to its suitability for high-dimensional sparse data and its strong performance in text classification tasks.</w:t>
       </w:r>
     </w:p>
     <w:p>
@@ -3888,6 +4115,128 @@
           <w:lang w:val="en-US"/>
         </w:rPr>
       </w:pPr>
+      <w:r>
+        <w:rPr>
+          <w:bCs w:val="0"/>
+          <w:lang w:val="en-US"/>
+        </w:rPr>
+        <w:t>The evaluated models were assessed using standard classification metrics, namely accuracy, precision, recall, and F1-score</w:t>
+      </w:r>
+      <w:r>
+        <w:rPr>
+          <w:bCs w:val="0"/>
+          <w:lang w:val="en-US"/>
+        </w:rPr>
+        <w:t xml:space="preserve"> [25]</w:t>
+      </w:r>
+      <w:r>
+        <w:rPr>
+          <w:bCs w:val="0"/>
+          <w:lang w:val="en-US"/>
+        </w:rPr>
+        <w:t>. In addition, the confusion matrix of the best-performing model was analyzed to examine the distribution of correct and incorrect predictions across the two classes.</w:t>
+      </w:r>
+    </w:p>
+    <w:p>
+      <w:pPr>
+        <w:widowControl w:val="0"/>
+        <w:autoSpaceDE w:val="0"/>
+        <w:autoSpaceDN w:val="0"/>
+        <w:adjustRightInd w:val="0"/>
+        <w:jc w:val="both"/>
+        <w:rPr>
+          <w:bCs w:val="0"/>
+          <w:lang w:val="en-US"/>
+        </w:rPr>
+      </w:pPr>
+    </w:p>
+    <w:p>
+      <w:pPr>
+        <w:widowControl w:val="0"/>
+        <w:autoSpaceDE w:val="0"/>
+        <w:autoSpaceDN w:val="0"/>
+        <w:adjustRightInd w:val="0"/>
+        <w:jc w:val="both"/>
+        <w:rPr>
+          <w:b/>
+          <w:lang w:val="en-US"/>
+        </w:rPr>
+      </w:pPr>
+      <w:r>
+        <w:rPr>
+          <w:b/>
+          <w:lang w:val="en-US"/>
+        </w:rPr>
+        <w:t xml:space="preserve">5.2 </w:t>
+      </w:r>
+      <w:r>
+        <w:rPr>
+          <w:b/>
+          <w:lang w:val="en-US"/>
+        </w:rPr>
+        <w:t>Results</w:t>
+      </w:r>
+    </w:p>
+    <w:p>
+      <w:pPr>
+        <w:widowControl w:val="0"/>
+        <w:autoSpaceDE w:val="0"/>
+        <w:autoSpaceDN w:val="0"/>
+        <w:adjustRightInd w:val="0"/>
+        <w:jc w:val="both"/>
+        <w:rPr>
+          <w:bCs w:val="0"/>
+          <w:lang w:val="en-US"/>
+        </w:rPr>
+      </w:pPr>
+      <w:r>
+        <w:rPr>
+          <w:bCs w:val="0"/>
+          <w:lang w:val="en-US"/>
+        </w:rPr>
+        <w:t>The classification results obtained for the three experiment</w:t>
+      </w:r>
+      <w:r>
+        <w:rPr>
+          <w:bCs w:val="0"/>
+          <w:lang w:val="en-US"/>
+        </w:rPr>
+        <w:t xml:space="preserve">s </w:t>
+      </w:r>
+      <w:r>
+        <w:rPr>
+          <w:bCs w:val="0"/>
+          <w:lang w:val="en-US"/>
+        </w:rPr>
+        <w:t xml:space="preserve">are summarized in Table </w:t>
+      </w:r>
+      <w:r>
+        <w:rPr>
+          <w:bCs w:val="0"/>
+          <w:lang w:val="en-US"/>
+        </w:rPr>
+        <w:t>4</w:t>
+      </w:r>
+      <w:r>
+        <w:rPr>
+          <w:bCs w:val="0"/>
+          <w:lang w:val="en-US"/>
+        </w:rPr>
+        <w:t>.</w:t>
+      </w:r>
+    </w:p>
+    <w:p>
+      <w:pPr>
+        <w:widowControl w:val="0"/>
+        <w:autoSpaceDE w:val="0"/>
+        <w:autoSpaceDN w:val="0"/>
+        <w:adjustRightInd w:val="0"/>
+        <w:jc w:val="both"/>
+        <w:rPr>
+          <w:bCs w:val="0"/>
+          <w:lang w:val="en-US"/>
+        </w:rPr>
+      </w:pPr>
     </w:p>
     <w:p>
       <w:pPr>
@@ -3906,7 +4255,14 @@
           <w:b/>
           <w:lang w:val="en-US"/>
         </w:rPr>
-        <w:t>Table 2</w:t>
+        <w:t xml:space="preserve">Table </w:t>
+      </w:r>
+      <w:r>
+        <w:rPr>
+          <w:b/>
+          <w:lang w:val="en-US"/>
+        </w:rPr>
+        <w:t>4</w:t>
       </w:r>
       <w:r>
         <w:rPr>
@@ -4471,7 +4827,6 @@
         <w:autoSpaceDE w:val="0"/>
         <w:autoSpaceDN w:val="0"/>
         <w:adjustRightInd w:val="0"/>
-        <w:ind w:firstLine="720"/>
         <w:jc w:val="both"/>
         <w:rPr>
           <w:bCs w:val="0"/>
@@ -4483,15 +4838,72 @@
           <w:bCs w:val="0"/>
           <w:lang w:val="en-US"/>
         </w:rPr>
-        <w:t xml:space="preserve">The baseline model reached an accuracy of 0.811, indicating that simple structural features already contain discriminative information for separating real and AI-generated reviews. </w:t>
-      </w:r>
-      <w:r>
-        <w:rPr>
-          <w:bCs w:val="0"/>
+        <w:t xml:space="preserve">The baseline model reached an accuracy of 0.811, indicating that simple structural features already contain discriminative information for separating real and AI-generated reviews. A clear increase in performance was observed after introducing lexical information through the </w:t>
+      </w:r>
+      <w:r>
+        <w:rPr>
+          <w:bCs w:val="0"/>
+          <w:i/>
+          <w:iCs/>
           <w:lang w:val="en-US"/>
         </w:rPr>
         <w:lastRenderedPageBreak/>
-        <w:t>A clear increase in performance was observed after introducing lexical information through the TF-IDF representation. In this setting, Logistic Regression achieved an accuracy of 0.953, showing that term-based features provide a substantially stronger representation than surface-level descriptors alone. The highest performance was obtained with the linear SVM classifier applied to the same TF-IDF feature space. In this configuration, the model reached an accuracy of 0.974, with similarly high values for precision, recall, and F1-score. The limited difference between the second and third experiments suggests that the main contribution to performance is provided by the lexical representation, while the choice of classifier yields a smaller</w:t>
+        <w:t>TF-IDF</w:t>
+      </w:r>
+      <w:r>
+        <w:rPr>
+          <w:bCs w:val="0"/>
+          <w:lang w:val="en-US"/>
+        </w:rPr>
+        <w:t xml:space="preserve"> representation. In this setting, </w:t>
+      </w:r>
+      <w:r>
+        <w:rPr>
+          <w:bCs w:val="0"/>
+          <w:i/>
+          <w:iCs/>
+          <w:lang w:val="en-US"/>
+        </w:rPr>
+        <w:t>Logistic Regression</w:t>
+      </w:r>
+      <w:r>
+        <w:rPr>
+          <w:bCs w:val="0"/>
+          <w:lang w:val="en-US"/>
+        </w:rPr>
+        <w:t xml:space="preserve"> achieved an accuracy of 0.953, showing that term-based features provide a substantially stronger representation than surface-level descriptors alone. The highest performance was obtained with the </w:t>
+      </w:r>
+      <w:r>
+        <w:rPr>
+          <w:bCs w:val="0"/>
+          <w:i/>
+          <w:iCs/>
+          <w:lang w:val="en-US"/>
+        </w:rPr>
+        <w:t>linear SVM</w:t>
+      </w:r>
+      <w:r>
+        <w:rPr>
+          <w:bCs w:val="0"/>
+          <w:lang w:val="en-US"/>
+        </w:rPr>
+        <w:t xml:space="preserve"> classifier applied to the same </w:t>
+      </w:r>
+      <w:r>
+        <w:rPr>
+          <w:bCs w:val="0"/>
+          <w:i/>
+          <w:iCs/>
+          <w:lang w:val="en-US"/>
+        </w:rPr>
+        <w:t>TF-IDF</w:t>
+      </w:r>
+      <w:r>
+        <w:rPr>
+          <w:bCs w:val="0"/>
+          <w:lang w:val="en-US"/>
+        </w:rPr>
+        <w:t xml:space="preserve"> feature space. In this configuration, the model reached an accuracy of 0.974, with similarly high values for precision, recall, and F1-score. The limited difference between the second and third experiments suggests that the main contribution to performance is provided by the lexical representation, while the choice of classifier yields a smaller</w:t>
       </w:r>
       <w:r>
         <w:rPr>
@@ -4712,7 +5124,6 @@
         <w:autoSpaceDE w:val="0"/>
         <w:autoSpaceDN w:val="0"/>
         <w:adjustRightInd w:val="0"/>
-        <w:ind w:firstLine="720"/>
         <w:jc w:val="both"/>
         <w:rPr>
           <w:bCs w:val="0"/>
@@ -4761,7 +5172,71 @@
           <w:bCs w:val="0"/>
           <w:lang w:val="en-US"/>
         </w:rPr>
-        <w:t xml:space="preserve"> identify the features that contribute most strongly to the classification process. The analysis was performed using SHAP, a model-agnostic explanation framework that quantifies the contribution of individual features to a given prediction [10]. The relevance of such an approach is also supported by recent work on explainable fake review detection and explainable e-commerce review analytics, which emphasizes that transparent model behavior is essential for understanding the mechanisms underlying manipulated textual content [9], [18]. In the present study, SHAP was applied to the linear SVM model trained on TF-IDF features, corresponding to the best-performing configuration of the proposed framework</w:t>
+        <w:t xml:space="preserve"> identify the features that contribute most strongly to the classification process. The analysis was performed using </w:t>
+      </w:r>
+      <w:r>
+        <w:rPr>
+          <w:bCs w:val="0"/>
+          <w:i/>
+          <w:iCs/>
+          <w:lang w:val="en-US"/>
+        </w:rPr>
+        <w:t>SHAP</w:t>
+      </w:r>
+      <w:r>
+        <w:rPr>
+          <w:bCs w:val="0"/>
+          <w:lang w:val="en-US"/>
+        </w:rPr>
+        <w:t xml:space="preserve">, a model-agnostic explanation framework that quantifies the contribution of individual features to a given prediction [10]. The relevance of such an approach is also supported by recent work on explainable fake review detection and explainable e-commerce review analytics, which emphasizes that transparent model behavior is essential for understanding the mechanisms underlying manipulated textual content [9], [18]. In the present study, </w:t>
+      </w:r>
+      <w:r>
+        <w:rPr>
+          <w:bCs w:val="0"/>
+          <w:i/>
+          <w:iCs/>
+          <w:lang w:val="en-US"/>
+        </w:rPr>
+        <w:t>SHAP</w:t>
+      </w:r>
+      <w:r>
+        <w:rPr>
+          <w:bCs w:val="0"/>
+          <w:lang w:val="en-US"/>
+        </w:rPr>
+        <w:t xml:space="preserve"> was applied to the </w:t>
+      </w:r>
+      <w:r>
+        <w:rPr>
+          <w:bCs w:val="0"/>
+          <w:i/>
+          <w:iCs/>
+          <w:lang w:val="en-US"/>
+        </w:rPr>
+        <w:t>linear SVM</w:t>
+      </w:r>
+      <w:r>
+        <w:rPr>
+          <w:bCs w:val="0"/>
+          <w:lang w:val="en-US"/>
+        </w:rPr>
+        <w:t xml:space="preserve"> model trained on </w:t>
+      </w:r>
+      <w:r>
+        <w:rPr>
+          <w:bCs w:val="0"/>
+          <w:i/>
+          <w:iCs/>
+          <w:lang w:val="en-US"/>
+        </w:rPr>
+        <w:t>TF-IDF</w:t>
+      </w:r>
+      <w:r>
+        <w:rPr>
+          <w:bCs w:val="0"/>
+          <w:lang w:val="en-US"/>
+        </w:rPr>
+        <w:t xml:space="preserve"> features, corresponding to the best-performing configuration of the proposed framework</w:t>
       </w:r>
       <w:r>
         <w:rPr>
@@ -4956,7 +5431,85 @@
           <w:bCs w:val="0"/>
           <w:lang w:val="en-US"/>
         </w:rPr>
-        <w:t xml:space="preserve">Figure 2 presents the SHAP summary plot obtained for the Logistic Regression model trained on TF-IDF features. Positive SHAP values indicate features that increase the probability of the AI-generated class, whereas negative values correspond to features more strongly associated with authentic reviews. The plot shows that the classification is influenced mainly by a limited subset of lexical features, including </w:t>
+        <w:t xml:space="preserve">Figure </w:t>
+      </w:r>
+      <w:r>
+        <w:rPr>
+          <w:bCs w:val="0"/>
+          <w:lang w:val="en-US"/>
+        </w:rPr>
+        <w:t>3</w:t>
+      </w:r>
+      <w:r>
+        <w:rPr>
+          <w:bCs w:val="0"/>
+          <w:lang w:val="en-US"/>
+        </w:rPr>
+        <w:t xml:space="preserve"> presents the </w:t>
+      </w:r>
+      <w:r>
+        <w:rPr>
+          <w:bCs w:val="0"/>
+          <w:i/>
+          <w:iCs/>
+          <w:lang w:val="en-US"/>
+        </w:rPr>
+        <w:t>SHAP</w:t>
+      </w:r>
+      <w:r>
+        <w:rPr>
+          <w:bCs w:val="0"/>
+          <w:lang w:val="en-US"/>
+        </w:rPr>
+        <w:t xml:space="preserve"> summary plot obtained for the </w:t>
+      </w:r>
+      <w:r>
+        <w:rPr>
+          <w:bCs w:val="0"/>
+          <w:i/>
+          <w:iCs/>
+          <w:lang w:val="en-US"/>
+        </w:rPr>
+        <w:t>Logistic Regression</w:t>
+      </w:r>
+      <w:r>
+        <w:rPr>
+          <w:bCs w:val="0"/>
+          <w:lang w:val="en-US"/>
+        </w:rPr>
+        <w:t xml:space="preserve"> model trained on </w:t>
+      </w:r>
+      <w:r>
+        <w:rPr>
+          <w:bCs w:val="0"/>
+          <w:i/>
+          <w:iCs/>
+          <w:lang w:val="en-US"/>
+        </w:rPr>
+        <w:t>TF-IDF</w:t>
+      </w:r>
+      <w:r>
+        <w:rPr>
+          <w:bCs w:val="0"/>
+          <w:lang w:val="en-US"/>
+        </w:rPr>
+        <w:t xml:space="preserve"> features. Positive </w:t>
+      </w:r>
+      <w:r>
+        <w:rPr>
+          <w:bCs w:val="0"/>
+          <w:i/>
+          <w:iCs/>
+          <w:lang w:val="en-US"/>
+        </w:rPr>
+        <w:t>SHAP</w:t>
+      </w:r>
+      <w:r>
+        <w:rPr>
+          <w:bCs w:val="0"/>
+          <w:lang w:val="en-US"/>
+        </w:rPr>
+        <w:t xml:space="preserve"> values indicate features that increase the probability of the AI-generated class, whereas negative values correspond to features more strongly associated with authentic reviews. The plot shows that the classification is influenced mainly by a limited subset of lexical features, including </w:t>
       </w:r>
       <w:r>
         <w:rPr>
@@ -5120,7 +5673,21 @@
           <w:bCs w:val="0"/>
           <w:lang w:val="en-US"/>
         </w:rPr>
-        <w:t xml:space="preserve">The feature distribution shown in Figure 2 suggests that the classification is influenced mainly by recurrent lexical regularities rather than by product-specific semantic content. Positive evaluative terms such as </w:t>
+        <w:t xml:space="preserve">The feature distribution shown in Figure </w:t>
+      </w:r>
+      <w:r>
+        <w:rPr>
+          <w:bCs w:val="0"/>
+          <w:lang w:val="en-US"/>
+        </w:rPr>
+        <w:t>3</w:t>
+      </w:r>
+      <w:r>
+        <w:rPr>
+          <w:bCs w:val="0"/>
+          <w:lang w:val="en-US"/>
+        </w:rPr>
+        <w:t xml:space="preserve"> suggests that the classification is influenced mainly by recurrent lexical regularities rather than by product-specific semantic content. Positive evaluative terms such as </w:t>
       </w:r>
       <w:r>
         <w:rPr>

</xml_diff>

<commit_message>
added subchapters for Results
</commit_message>
<xml_diff>
--- a/doc/journal_paper.docx
+++ b/doc/journal_paper.docx
@@ -1421,6 +1421,19 @@
         </w:rPr>
         <w:t>The dataset is approximately balanced, allowing a fair evaluation of the classification models without requiring additional balancing techniques.</w:t>
       </w:r>
+    </w:p>
+    <w:p>
+      <w:pPr>
+        <w:widowControl w:val="0"/>
+        <w:autoSpaceDE w:val="0"/>
+        <w:autoSpaceDN w:val="0"/>
+        <w:adjustRightInd w:val="0"/>
+        <w:jc w:val="both"/>
+        <w:rPr>
+          <w:bCs w:val="0"/>
+          <w:lang w:val="en-US"/>
+        </w:rPr>
+      </w:pPr>
     </w:p>
     <w:p>
       <w:pPr>
@@ -2071,6 +2084,7 @@
           <w:b/>
           <w:lang w:val="en-US"/>
         </w:rPr>
+        <w:lastRenderedPageBreak/>
         <w:t xml:space="preserve">Table </w:t>
       </w:r>
       <w:r>
@@ -2135,7 +2149,6 @@
                 <w:b/>
                 <w:lang w:val="en-US"/>
               </w:rPr>
-              <w:lastRenderedPageBreak/>
               <w:t>Feature</w:t>
             </w:r>
           </w:p>
@@ -3332,6 +3345,24 @@
         </w:rPr>
         <w:t>.</w:t>
       </w:r>
+      <w:r>
+        <w:rPr>
+          <w:bCs w:val="0"/>
+          <w:lang w:val="en-US"/>
+        </w:rPr>
+        <w:t xml:space="preserve"> </w:t>
+      </w:r>
+      <w:r>
+        <w:t xml:space="preserve">In addition, a supplementary sensitivity analysis was conducted </w:t>
+      </w:r>
+      <w:proofErr w:type="gramStart"/>
+      <w:r>
+        <w:t>in order to</w:t>
+      </w:r>
+      <w:proofErr w:type="gramEnd"/>
+      <w:r>
+        <w:t xml:space="preserve"> compare the unigram–bigram representation with a unigram-only TF-IDF configuration for the lexical classification models.</w:t>
+      </w:r>
     </w:p>
     <w:p>
       <w:pPr>
@@ -3587,7 +3618,15 @@
           <w:bCs w:val="0"/>
           <w:lang w:val="en-US"/>
         </w:rPr>
-        <w:t xml:space="preserve"> representation. This experiment was introduced to assess the effect of lexical information independently of the final classifier and to measure the improvement obtained when moving from surface-level descriptors to sparse term-based features.</w:t>
+        <w:t xml:space="preserve"> representation. </w:t>
+      </w:r>
+      <w:r>
+        <w:rPr>
+          <w:bCs w:val="0"/>
+          <w:lang w:val="en-US"/>
+        </w:rPr>
+        <w:lastRenderedPageBreak/>
+        <w:t>This experiment was introduced to assess the effect of lexical information independently of the final classifier and to measure the improvement obtained when moving from surface-level descriptors to sparse term-based features.</w:t>
       </w:r>
     </w:p>
     <w:p>
@@ -3607,7 +3646,6 @@
           <w:bCs w:val="0"/>
           <w:lang w:val="en-US"/>
         </w:rPr>
-        <w:lastRenderedPageBreak/>
         <w:t xml:space="preserve">The third configuration corresponds to the main model of the proposed framework. In this case, a </w:t>
       </w:r>
       <w:r>
@@ -4135,6 +4173,24 @@
           <w:lang w:val="en-US"/>
         </w:rPr>
         <w:t>. In addition, the confusion matrix of the best-performing model was analyzed to examine the distribution of correct and incorrect predictions across the two classes.</w:t>
+      </w:r>
+      <w:r>
+        <w:rPr>
+          <w:bCs w:val="0"/>
+          <w:lang w:val="en-US"/>
+        </w:rPr>
+        <w:t xml:space="preserve"> </w:t>
+      </w:r>
+      <w:r>
+        <w:t xml:space="preserve">In addition to the three main experimental settings, a supplementary sensitivity analysis was performed </w:t>
+      </w:r>
+      <w:proofErr w:type="gramStart"/>
+      <w:r>
+        <w:t>in order to</w:t>
+      </w:r>
+      <w:proofErr w:type="gramEnd"/>
+      <w:r>
+        <w:t xml:space="preserve"> examine the effect of the TF-IDF n-gram configuration, by comparing unigram-only and unigram–bigram representations for the lexical models.</w:t>
       </w:r>
     </w:p>
     <w:p>
@@ -4702,6 +4758,7 @@
                 <w:bCs w:val="0"/>
                 <w:lang w:val="en-US"/>
               </w:rPr>
+              <w:lastRenderedPageBreak/>
               <w:t>SVM + TF-IDF</w:t>
             </w:r>
           </w:p>
@@ -4847,7 +4904,6 @@
           <w:iCs/>
           <w:lang w:val="en-US"/>
         </w:rPr>
-        <w:lastRenderedPageBreak/>
         <w:t>TF-IDF</w:t>
       </w:r>
       <w:r>
@@ -5101,22 +5157,521 @@
           <w:b/>
           <w:lang w:val="en-US"/>
         </w:rPr>
-        <w:t xml:space="preserve">6 </w:t>
+        <w:t>5.</w:t>
       </w:r>
       <w:r>
         <w:rPr>
           <w:b/>
           <w:lang w:val="en-US"/>
         </w:rPr>
-        <w:t>Explainability Analysi</w:t>
+        <w:t>3</w:t>
       </w:r>
       <w:r>
         <w:rPr>
           <w:b/>
           <w:lang w:val="en-US"/>
         </w:rPr>
-        <w:t>s</w:t>
-      </w:r>
+        <w:t xml:space="preserve"> </w:t>
+      </w:r>
+      <w:r>
+        <w:rPr>
+          <w:b/>
+          <w:lang w:val="en-US"/>
+        </w:rPr>
+        <w:t>Error Analysis</w:t>
+      </w:r>
+    </w:p>
+    <w:p>
+      <w:pPr>
+        <w:widowControl w:val="0"/>
+        <w:autoSpaceDE w:val="0"/>
+        <w:autoSpaceDN w:val="0"/>
+        <w:adjustRightInd w:val="0"/>
+        <w:jc w:val="center"/>
+        <w:rPr>
+          <w:b/>
+          <w:lang w:val="en-US"/>
+        </w:rPr>
+      </w:pPr>
+      <w:r>
+        <w:rPr>
+          <w:b/>
+          <w:lang w:val="en-US"/>
+        </w:rPr>
+        <w:t xml:space="preserve">Table 5. </w:t>
+      </w:r>
+      <w:r>
+        <w:rPr>
+          <w:bCs w:val="0"/>
+          <w:lang w:val="en-US"/>
+        </w:rPr>
+        <w:t>Examples of misclassified reviews</w:t>
+      </w:r>
+    </w:p>
+    <w:tbl>
+      <w:tblPr>
+        <w:tblStyle w:val="TableGrid"/>
+        <w:tblW w:w="0" w:type="auto"/>
+        <w:tblLook w:val="04A0" w:firstRow="1" w:lastRow="0" w:firstColumn="1" w:lastColumn="0" w:noHBand="0" w:noVBand="1"/>
+      </w:tblPr>
+      <w:tblGrid>
+        <w:gridCol w:w="3681"/>
+        <w:gridCol w:w="849"/>
+        <w:gridCol w:w="1277"/>
+        <w:gridCol w:w="3254"/>
+      </w:tblGrid>
+      <w:tr>
+        <w:tc>
+          <w:tcPr>
+            <w:tcW w:w="3681" w:type="dxa"/>
+            <w:vAlign w:val="center"/>
+          </w:tcPr>
+          <w:p>
+            <w:pPr>
+              <w:widowControl w:val="0"/>
+              <w:autoSpaceDE w:val="0"/>
+              <w:autoSpaceDN w:val="0"/>
+              <w:adjustRightInd w:val="0"/>
+              <w:jc w:val="center"/>
+              <w:rPr>
+                <w:b/>
+                <w:lang w:val="en-US"/>
+              </w:rPr>
+            </w:pPr>
+            <w:r>
+              <w:rPr>
+                <w:b/>
+                <w:lang w:val="en-US"/>
+              </w:rPr>
+              <w:t>Review type</w:t>
+            </w:r>
+          </w:p>
+        </w:tc>
+        <w:tc>
+          <w:tcPr>
+            <w:tcW w:w="849" w:type="dxa"/>
+            <w:vAlign w:val="center"/>
+          </w:tcPr>
+          <w:p>
+            <w:pPr>
+              <w:widowControl w:val="0"/>
+              <w:autoSpaceDE w:val="0"/>
+              <w:autoSpaceDN w:val="0"/>
+              <w:adjustRightInd w:val="0"/>
+              <w:jc w:val="center"/>
+              <w:rPr>
+                <w:b/>
+                <w:lang w:val="en-US"/>
+              </w:rPr>
+            </w:pPr>
+            <w:r>
+              <w:rPr>
+                <w:b/>
+                <w:lang w:val="en-US"/>
+              </w:rPr>
+              <w:t>True label</w:t>
+            </w:r>
+          </w:p>
+        </w:tc>
+        <w:tc>
+          <w:tcPr>
+            <w:tcW w:w="1277" w:type="dxa"/>
+            <w:vAlign w:val="center"/>
+          </w:tcPr>
+          <w:p>
+            <w:pPr>
+              <w:widowControl w:val="0"/>
+              <w:autoSpaceDE w:val="0"/>
+              <w:autoSpaceDN w:val="0"/>
+              <w:adjustRightInd w:val="0"/>
+              <w:jc w:val="center"/>
+              <w:rPr>
+                <w:b/>
+                <w:lang w:val="en-US"/>
+              </w:rPr>
+            </w:pPr>
+            <w:r>
+              <w:rPr>
+                <w:b/>
+                <w:lang w:val="en-US"/>
+              </w:rPr>
+              <w:t>Predicted label</w:t>
+            </w:r>
+          </w:p>
+        </w:tc>
+        <w:tc>
+          <w:tcPr>
+            <w:tcW w:w="3254" w:type="dxa"/>
+            <w:vAlign w:val="center"/>
+          </w:tcPr>
+          <w:p>
+            <w:pPr>
+              <w:widowControl w:val="0"/>
+              <w:autoSpaceDE w:val="0"/>
+              <w:autoSpaceDN w:val="0"/>
+              <w:adjustRightInd w:val="0"/>
+              <w:jc w:val="center"/>
+              <w:rPr>
+                <w:b/>
+                <w:lang w:val="en-US"/>
+              </w:rPr>
+            </w:pPr>
+            <w:r>
+              <w:rPr>
+                <w:b/>
+                <w:lang w:val="en-US"/>
+              </w:rPr>
+              <w:t>Possible explanation</w:t>
+            </w:r>
+          </w:p>
+        </w:tc>
+      </w:tr>
+      <w:tr>
+        <w:tc>
+          <w:tcPr>
+            <w:tcW w:w="3681" w:type="dxa"/>
+            <w:vAlign w:val="center"/>
+          </w:tcPr>
+          <w:p>
+            <w:pPr>
+              <w:widowControl w:val="0"/>
+              <w:autoSpaceDE w:val="0"/>
+              <w:autoSpaceDN w:val="0"/>
+              <w:adjustRightInd w:val="0"/>
+              <w:rPr>
+                <w:bCs w:val="0"/>
+                <w:lang w:val="en-US"/>
+              </w:rPr>
+            </w:pPr>
+            <w:r>
+              <w:rPr>
+                <w:bCs w:val="0"/>
+                <w:lang w:val="en-US"/>
+              </w:rPr>
+              <w:t>Real review with generic positive tone</w:t>
+            </w:r>
+          </w:p>
+        </w:tc>
+        <w:tc>
+          <w:tcPr>
+            <w:tcW w:w="849" w:type="dxa"/>
+            <w:vAlign w:val="center"/>
+          </w:tcPr>
+          <w:p>
+            <w:pPr>
+              <w:widowControl w:val="0"/>
+              <w:autoSpaceDE w:val="0"/>
+              <w:autoSpaceDN w:val="0"/>
+              <w:adjustRightInd w:val="0"/>
+              <w:rPr>
+                <w:bCs w:val="0"/>
+                <w:lang w:val="en-US"/>
+              </w:rPr>
+            </w:pPr>
+            <w:r>
+              <w:rPr>
+                <w:bCs w:val="0"/>
+                <w:lang w:val="en-US"/>
+              </w:rPr>
+              <w:t>Real</w:t>
+            </w:r>
+          </w:p>
+        </w:tc>
+        <w:tc>
+          <w:tcPr>
+            <w:tcW w:w="1277" w:type="dxa"/>
+            <w:vAlign w:val="center"/>
+          </w:tcPr>
+          <w:p>
+            <w:pPr>
+              <w:widowControl w:val="0"/>
+              <w:autoSpaceDE w:val="0"/>
+              <w:autoSpaceDN w:val="0"/>
+              <w:adjustRightInd w:val="0"/>
+              <w:rPr>
+                <w:bCs w:val="0"/>
+                <w:lang w:val="en-US"/>
+              </w:rPr>
+            </w:pPr>
+            <w:r>
+              <w:rPr>
+                <w:bCs w:val="0"/>
+                <w:lang w:val="en-US"/>
+              </w:rPr>
+              <w:t>AI</w:t>
+            </w:r>
+          </w:p>
+        </w:tc>
+        <w:tc>
+          <w:tcPr>
+            <w:tcW w:w="3254" w:type="dxa"/>
+            <w:vAlign w:val="center"/>
+          </w:tcPr>
+          <w:p>
+            <w:pPr>
+              <w:widowControl w:val="0"/>
+              <w:autoSpaceDE w:val="0"/>
+              <w:autoSpaceDN w:val="0"/>
+              <w:adjustRightInd w:val="0"/>
+              <w:rPr>
+                <w:bCs w:val="0"/>
+                <w:lang w:val="en-US"/>
+              </w:rPr>
+            </w:pPr>
+            <w:r>
+              <w:rPr>
+                <w:bCs w:val="0"/>
+                <w:lang w:val="en-US"/>
+              </w:rPr>
+              <w:t>resembles templated evaluative language</w:t>
+            </w:r>
+          </w:p>
+        </w:tc>
+      </w:tr>
+      <w:tr>
+        <w:tc>
+          <w:tcPr>
+            <w:tcW w:w="3681" w:type="dxa"/>
+            <w:vAlign w:val="center"/>
+          </w:tcPr>
+          <w:p>
+            <w:pPr>
+              <w:widowControl w:val="0"/>
+              <w:autoSpaceDE w:val="0"/>
+              <w:autoSpaceDN w:val="0"/>
+              <w:adjustRightInd w:val="0"/>
+              <w:rPr>
+                <w:bCs w:val="0"/>
+                <w:lang w:val="en-US"/>
+              </w:rPr>
+            </w:pPr>
+            <w:r>
+              <w:rPr>
+                <w:bCs w:val="0"/>
+                <w:lang w:val="en-US"/>
+              </w:rPr>
+              <w:t>AI-generated review with natural phrasing</w:t>
+            </w:r>
+          </w:p>
+        </w:tc>
+        <w:tc>
+          <w:tcPr>
+            <w:tcW w:w="849" w:type="dxa"/>
+            <w:vAlign w:val="center"/>
+          </w:tcPr>
+          <w:p>
+            <w:pPr>
+              <w:widowControl w:val="0"/>
+              <w:autoSpaceDE w:val="0"/>
+              <w:autoSpaceDN w:val="0"/>
+              <w:adjustRightInd w:val="0"/>
+              <w:rPr>
+                <w:bCs w:val="0"/>
+                <w:lang w:val="en-US"/>
+              </w:rPr>
+            </w:pPr>
+            <w:r>
+              <w:rPr>
+                <w:bCs w:val="0"/>
+                <w:lang w:val="en-US"/>
+              </w:rPr>
+              <w:t>AI</w:t>
+            </w:r>
+          </w:p>
+        </w:tc>
+        <w:tc>
+          <w:tcPr>
+            <w:tcW w:w="1277" w:type="dxa"/>
+            <w:vAlign w:val="center"/>
+          </w:tcPr>
+          <w:p>
+            <w:pPr>
+              <w:widowControl w:val="0"/>
+              <w:autoSpaceDE w:val="0"/>
+              <w:autoSpaceDN w:val="0"/>
+              <w:adjustRightInd w:val="0"/>
+              <w:rPr>
+                <w:bCs w:val="0"/>
+                <w:lang w:val="en-US"/>
+              </w:rPr>
+            </w:pPr>
+            <w:r>
+              <w:rPr>
+                <w:bCs w:val="0"/>
+                <w:lang w:val="en-US"/>
+              </w:rPr>
+              <w:t>Real</w:t>
+            </w:r>
+          </w:p>
+        </w:tc>
+        <w:tc>
+          <w:tcPr>
+            <w:tcW w:w="3254" w:type="dxa"/>
+            <w:vAlign w:val="center"/>
+          </w:tcPr>
+          <w:p>
+            <w:pPr>
+              <w:widowControl w:val="0"/>
+              <w:autoSpaceDE w:val="0"/>
+              <w:autoSpaceDN w:val="0"/>
+              <w:adjustRightInd w:val="0"/>
+              <w:rPr>
+                <w:bCs w:val="0"/>
+                <w:lang w:val="en-US"/>
+              </w:rPr>
+            </w:pPr>
+            <w:r>
+              <w:rPr>
+                <w:bCs w:val="0"/>
+                <w:lang w:val="en-US"/>
+              </w:rPr>
+              <w:t>lacks strong lexical regularities</w:t>
+            </w:r>
+          </w:p>
+        </w:tc>
+      </w:tr>
+      <w:tr>
+        <w:tc>
+          <w:tcPr>
+            <w:tcW w:w="3681" w:type="dxa"/>
+            <w:vAlign w:val="center"/>
+          </w:tcPr>
+          <w:p>
+            <w:pPr>
+              <w:widowControl w:val="0"/>
+              <w:autoSpaceDE w:val="0"/>
+              <w:autoSpaceDN w:val="0"/>
+              <w:adjustRightInd w:val="0"/>
+              <w:rPr>
+                <w:bCs w:val="0"/>
+                <w:lang w:val="en-US"/>
+              </w:rPr>
+            </w:pPr>
+            <w:r>
+              <w:rPr>
+                <w:bCs w:val="0"/>
+                <w:lang w:val="en-US"/>
+              </w:rPr>
+              <w:t>Real review with balanced style</w:t>
+            </w:r>
+          </w:p>
+        </w:tc>
+        <w:tc>
+          <w:tcPr>
+            <w:tcW w:w="849" w:type="dxa"/>
+            <w:vAlign w:val="center"/>
+          </w:tcPr>
+          <w:p>
+            <w:pPr>
+              <w:widowControl w:val="0"/>
+              <w:autoSpaceDE w:val="0"/>
+              <w:autoSpaceDN w:val="0"/>
+              <w:adjustRightInd w:val="0"/>
+              <w:rPr>
+                <w:bCs w:val="0"/>
+                <w:lang w:val="en-US"/>
+              </w:rPr>
+            </w:pPr>
+            <w:r>
+              <w:rPr>
+                <w:bCs w:val="0"/>
+                <w:lang w:val="en-US"/>
+              </w:rPr>
+              <w:t>Real</w:t>
+            </w:r>
+          </w:p>
+        </w:tc>
+        <w:tc>
+          <w:tcPr>
+            <w:tcW w:w="1277" w:type="dxa"/>
+            <w:vAlign w:val="center"/>
+          </w:tcPr>
+          <w:p>
+            <w:pPr>
+              <w:widowControl w:val="0"/>
+              <w:autoSpaceDE w:val="0"/>
+              <w:autoSpaceDN w:val="0"/>
+              <w:adjustRightInd w:val="0"/>
+              <w:rPr>
+                <w:bCs w:val="0"/>
+                <w:lang w:val="en-US"/>
+              </w:rPr>
+            </w:pPr>
+            <w:r>
+              <w:rPr>
+                <w:bCs w:val="0"/>
+                <w:lang w:val="en-US"/>
+              </w:rPr>
+              <w:t>AI</w:t>
+            </w:r>
+          </w:p>
+        </w:tc>
+        <w:tc>
+          <w:tcPr>
+            <w:tcW w:w="3254" w:type="dxa"/>
+            <w:vAlign w:val="center"/>
+          </w:tcPr>
+          <w:p>
+            <w:pPr>
+              <w:widowControl w:val="0"/>
+              <w:autoSpaceDE w:val="0"/>
+              <w:autoSpaceDN w:val="0"/>
+              <w:adjustRightInd w:val="0"/>
+              <w:rPr>
+                <w:bCs w:val="0"/>
+                <w:lang w:val="en-US"/>
+              </w:rPr>
+            </w:pPr>
+            <w:r>
+              <w:rPr>
+                <w:bCs w:val="0"/>
+                <w:lang w:val="en-US"/>
+              </w:rPr>
+              <w:t xml:space="preserve">contains mild contrast markers </w:t>
+            </w:r>
+            <w:proofErr w:type="gramStart"/>
+            <w:r>
+              <w:rPr>
+                <w:bCs w:val="0"/>
+                <w:lang w:val="en-US"/>
+              </w:rPr>
+              <w:t>similar to</w:t>
+            </w:r>
+            <w:proofErr w:type="gramEnd"/>
+            <w:r>
+              <w:rPr>
+                <w:bCs w:val="0"/>
+                <w:lang w:val="en-US"/>
+              </w:rPr>
+              <w:t xml:space="preserve"> generated text</w:t>
+            </w:r>
+          </w:p>
+        </w:tc>
+      </w:tr>
+    </w:tbl>
+    <w:p>
+      <w:pPr>
+        <w:widowControl w:val="0"/>
+        <w:autoSpaceDE w:val="0"/>
+        <w:autoSpaceDN w:val="0"/>
+        <w:adjustRightInd w:val="0"/>
+        <w:rPr>
+          <w:bCs w:val="0"/>
+          <w:lang w:val="en-US"/>
+        </w:rPr>
+      </w:pPr>
+    </w:p>
+    <w:p>
+      <w:pPr>
+        <w:widowControl w:val="0"/>
+        <w:autoSpaceDE w:val="0"/>
+        <w:autoSpaceDN w:val="0"/>
+        <w:adjustRightInd w:val="0"/>
+        <w:rPr>
+          <w:bCs w:val="0"/>
+          <w:lang w:val="en-US"/>
+        </w:rPr>
+      </w:pPr>
     </w:p>
     <w:p>
       <w:pPr>
@@ -5135,28 +5690,7 @@
           <w:bCs w:val="0"/>
           <w:lang w:val="en-US"/>
         </w:rPr>
-        <w:t>T</w:t>
-      </w:r>
-      <w:r>
-        <w:rPr>
-          <w:bCs w:val="0"/>
-          <w:lang w:val="en-US"/>
-        </w:rPr>
-        <w:t>he classification results indicate that the proposed framework is effective in distinguishing between real and AI-generated reviews</w:t>
-      </w:r>
-      <w:r>
-        <w:rPr>
-          <w:bCs w:val="0"/>
-          <w:lang w:val="en-US"/>
-        </w:rPr>
-        <w:t>. However,</w:t>
-      </w:r>
-      <w:r>
-        <w:rPr>
-          <w:bCs w:val="0"/>
-          <w:lang w:val="en-US"/>
-        </w:rPr>
-        <w:t xml:space="preserve"> predictive performance alone does not explain which linguistic patterns drive the model decisions. This aspect is particularly relevant in the context of AI-generated fake review detection, where the distinction between manipulated and authentic content may depend on subtle lexical regularities rather than on obvious semantic cues [8], [17]. For this reason, an additional explainability analysis was conducted </w:t>
+        <w:t xml:space="preserve">The examples summarized in Table 5 indicate that the remaining classification errors are not </w:t>
       </w:r>
       <w:proofErr w:type="gramStart"/>
       <w:r>
@@ -5164,7 +5698,7 @@
           <w:bCs w:val="0"/>
           <w:lang w:val="en-US"/>
         </w:rPr>
-        <w:t>in order to</w:t>
+        <w:t>random, but</w:t>
       </w:r>
       <w:proofErr w:type="gramEnd"/>
       <w:r>
@@ -5172,13 +5706,1122 @@
           <w:bCs w:val="0"/>
           <w:lang w:val="en-US"/>
         </w:rPr>
-        <w:t xml:space="preserve"> identify the features that contribute most strongly to the classification process. The analysis was performed using </w:t>
-      </w:r>
-      <w:r>
-        <w:rPr>
-          <w:bCs w:val="0"/>
+        <w:t xml:space="preserve"> are concentrated in cases where the lexical profile of the two classes partially overlaps. </w:t>
+      </w:r>
+      <w:proofErr w:type="gramStart"/>
+      <w:r>
+        <w:rPr>
+          <w:bCs w:val="0"/>
+          <w:lang w:val="en-US"/>
+        </w:rPr>
+        <w:t>In particular, false</w:t>
+      </w:r>
+      <w:proofErr w:type="gramEnd"/>
+      <w:r>
+        <w:rPr>
+          <w:bCs w:val="0"/>
+          <w:lang w:val="en-US"/>
+        </w:rPr>
+        <w:t xml:space="preserve"> positives tend to occur when authentic reviews contain generic positive language, broad evaluative expressions, or balanced formulations </w:t>
+      </w:r>
+      <w:proofErr w:type="gramStart"/>
+      <w:r>
+        <w:rPr>
+          <w:bCs w:val="0"/>
+          <w:lang w:val="en-US"/>
+        </w:rPr>
+        <w:t>similar to</w:t>
+      </w:r>
+      <w:proofErr w:type="gramEnd"/>
+      <w:r>
+        <w:rPr>
+          <w:bCs w:val="0"/>
+          <w:lang w:val="en-US"/>
+        </w:rPr>
+        <w:t xml:space="preserve"> those observed in generated content. Such cases suggest that some real reviews naturally exhibit stylistic patterns that resemble the regularized phrasing learned by the model from the AI-generated class.</w:t>
+      </w:r>
+    </w:p>
+    <w:p>
+      <w:pPr>
+        <w:widowControl w:val="0"/>
+        <w:autoSpaceDE w:val="0"/>
+        <w:autoSpaceDN w:val="0"/>
+        <w:adjustRightInd w:val="0"/>
+        <w:jc w:val="both"/>
+        <w:rPr>
+          <w:bCs w:val="0"/>
+          <w:lang w:val="en-US"/>
+        </w:rPr>
+      </w:pPr>
+      <w:r>
+        <w:rPr>
+          <w:bCs w:val="0"/>
+          <w:lang w:val="en-US"/>
+        </w:rPr>
+        <w:lastRenderedPageBreak/>
+        <w:t xml:space="preserve">False negatives appear when AI-generated reviews are expressed in a more concise and less formulaic manner, without the stronger lexical regularities that typically characterize generated text. This behavior indicates that the proposed approach is highly </w:t>
+      </w:r>
+      <w:proofErr w:type="gramStart"/>
+      <w:r>
+        <w:rPr>
+          <w:bCs w:val="0"/>
+          <w:lang w:val="en-US"/>
+        </w:rPr>
+        <w:t>effective, but</w:t>
+      </w:r>
+      <w:proofErr w:type="gramEnd"/>
+      <w:r>
+        <w:rPr>
+          <w:bCs w:val="0"/>
+          <w:lang w:val="en-US"/>
+        </w:rPr>
+        <w:t xml:space="preserve"> remains sensitive to borderline examples in which the stylistic distinction between authentic and generated reviews is attenuated. Overall, the error pattern is consistent with the explainability analysis presented in Section 6, which showed that the classification is driven primarily by lexical and stylistic regularities rather than by product-specific semantic content.</w:t>
+      </w:r>
+    </w:p>
+    <w:p>
+      <w:pPr>
+        <w:widowControl w:val="0"/>
+        <w:autoSpaceDE w:val="0"/>
+        <w:autoSpaceDN w:val="0"/>
+        <w:adjustRightInd w:val="0"/>
+        <w:jc w:val="both"/>
+        <w:rPr>
+          <w:bCs w:val="0"/>
+          <w:lang w:val="en-US"/>
+        </w:rPr>
+      </w:pPr>
+    </w:p>
+    <w:p>
+      <w:pPr>
+        <w:widowControl w:val="0"/>
+        <w:autoSpaceDE w:val="0"/>
+        <w:autoSpaceDN w:val="0"/>
+        <w:adjustRightInd w:val="0"/>
+        <w:jc w:val="both"/>
+        <w:rPr>
+          <w:b/>
+          <w:lang w:val="en-US"/>
+        </w:rPr>
+      </w:pPr>
+      <w:r>
+        <w:rPr>
+          <w:b/>
+          <w:lang w:val="en-US"/>
+        </w:rPr>
+        <w:t>5.</w:t>
+      </w:r>
+      <w:r>
+        <w:rPr>
+          <w:b/>
+          <w:lang w:val="en-US"/>
+        </w:rPr>
+        <w:t>4</w:t>
+      </w:r>
+      <w:r>
+        <w:rPr>
+          <w:b/>
+          <w:lang w:val="en-US"/>
+        </w:rPr>
+        <w:t xml:space="preserve"> Ablation Study on N-gram Configuration</w:t>
+      </w:r>
+    </w:p>
+    <w:p>
+      <w:pPr>
+        <w:widowControl w:val="0"/>
+        <w:autoSpaceDE w:val="0"/>
+        <w:autoSpaceDN w:val="0"/>
+        <w:adjustRightInd w:val="0"/>
+        <w:jc w:val="both"/>
+      </w:pPr>
+      <w:proofErr w:type="gramStart"/>
+      <w:r>
+        <w:t>In order to</w:t>
+      </w:r>
+      <w:proofErr w:type="gramEnd"/>
+      <w:r>
+        <w:t xml:space="preserve"> further examine the contribution of short contextual information to the detection task, an additional sensitivity analysis was conducted on the lexical models. More specifically, the </w:t>
+      </w:r>
+      <w:r>
+        <w:rPr>
           <w:i/>
           <w:iCs/>
+        </w:rPr>
+        <w:t>TF-IDF</w:t>
+      </w:r>
+      <w:r>
+        <w:t xml:space="preserve"> representation based on unigrams and bigrams was compared against a unigram-only configuration for both </w:t>
+      </w:r>
+      <w:r>
+        <w:rPr>
+          <w:i/>
+          <w:iCs/>
+        </w:rPr>
+        <w:t>Logistic Regression</w:t>
+      </w:r>
+      <w:r>
+        <w:t xml:space="preserve"> and </w:t>
+      </w:r>
+      <w:r>
+        <w:rPr>
+          <w:i/>
+          <w:iCs/>
+        </w:rPr>
+        <w:t>linear SVM</w:t>
+      </w:r>
+      <w:r>
+        <w:t>. The purpose of this analysis was to evaluate whether the inclusion of bigrams provides a measurable improvement beyond single-term lexical cues.</w:t>
+      </w:r>
+    </w:p>
+    <w:p>
+      <w:pPr>
+        <w:widowControl w:val="0"/>
+        <w:autoSpaceDE w:val="0"/>
+        <w:autoSpaceDN w:val="0"/>
+        <w:adjustRightInd w:val="0"/>
+        <w:jc w:val="center"/>
+        <w:rPr>
+          <w:bCs w:val="0"/>
+          <w:lang w:val="en-US"/>
+        </w:rPr>
+      </w:pPr>
+      <w:r>
+        <w:rPr>
+          <w:b/>
+          <w:lang w:val="en-US"/>
+        </w:rPr>
+        <w:t>Table 6.</w:t>
+      </w:r>
+      <w:r>
+        <w:rPr>
+          <w:bCs w:val="0"/>
+          <w:lang w:val="en-US"/>
+        </w:rPr>
+        <w:t xml:space="preserve"> Effect of n-gram configuration on lexical model performance</w:t>
+      </w:r>
+    </w:p>
+    <w:tbl>
+      <w:tblPr>
+        <w:tblStyle w:val="TableGrid"/>
+        <w:tblW w:w="0" w:type="auto"/>
+        <w:jc w:val="center"/>
+        <w:tblLook w:val="04A0" w:firstRow="1" w:lastRow="0" w:firstColumn="1" w:lastColumn="0" w:noHBand="0" w:noVBand="1"/>
+      </w:tblPr>
+      <w:tblGrid>
+        <w:gridCol w:w="1413"/>
+        <w:gridCol w:w="1984"/>
+        <w:gridCol w:w="1230"/>
+        <w:gridCol w:w="1230"/>
+        <w:gridCol w:w="1230"/>
+        <w:gridCol w:w="1230"/>
+      </w:tblGrid>
+      <w:tr>
+        <w:trPr>
+          <w:jc w:val="center"/>
+        </w:trPr>
+        <w:tc>
+          <w:tcPr>
+            <w:tcW w:w="1413" w:type="dxa"/>
+            <w:vAlign w:val="center"/>
+          </w:tcPr>
+          <w:p>
+            <w:pPr>
+              <w:widowControl w:val="0"/>
+              <w:autoSpaceDE w:val="0"/>
+              <w:autoSpaceDN w:val="0"/>
+              <w:adjustRightInd w:val="0"/>
+              <w:jc w:val="center"/>
+              <w:rPr>
+                <w:bCs w:val="0"/>
+                <w:lang w:val="en-US"/>
+              </w:rPr>
+            </w:pPr>
+            <w:r>
+              <w:rPr>
+                <w:b/>
+                <w:bCs w:val="0"/>
+              </w:rPr>
+              <w:t>Model</w:t>
+            </w:r>
+          </w:p>
+        </w:tc>
+        <w:tc>
+          <w:tcPr>
+            <w:tcW w:w="1984" w:type="dxa"/>
+            <w:vAlign w:val="center"/>
+          </w:tcPr>
+          <w:p>
+            <w:pPr>
+              <w:widowControl w:val="0"/>
+              <w:autoSpaceDE w:val="0"/>
+              <w:autoSpaceDN w:val="0"/>
+              <w:adjustRightInd w:val="0"/>
+              <w:jc w:val="center"/>
+              <w:rPr>
+                <w:bCs w:val="0"/>
+                <w:lang w:val="en-US"/>
+              </w:rPr>
+            </w:pPr>
+            <w:r>
+              <w:rPr>
+                <w:b/>
+                <w:bCs w:val="0"/>
+              </w:rPr>
+              <w:t>TF-IDF features</w:t>
+            </w:r>
+          </w:p>
+        </w:tc>
+        <w:tc>
+          <w:tcPr>
+            <w:tcW w:w="1230" w:type="dxa"/>
+            <w:vAlign w:val="center"/>
+          </w:tcPr>
+          <w:p>
+            <w:pPr>
+              <w:widowControl w:val="0"/>
+              <w:autoSpaceDE w:val="0"/>
+              <w:autoSpaceDN w:val="0"/>
+              <w:adjustRightInd w:val="0"/>
+              <w:jc w:val="center"/>
+              <w:rPr>
+                <w:bCs w:val="0"/>
+                <w:lang w:val="en-US"/>
+              </w:rPr>
+            </w:pPr>
+            <w:r>
+              <w:rPr>
+                <w:b/>
+                <w:bCs w:val="0"/>
+              </w:rPr>
+              <w:t>Accuracy</w:t>
+            </w:r>
+          </w:p>
+        </w:tc>
+        <w:tc>
+          <w:tcPr>
+            <w:tcW w:w="1230" w:type="dxa"/>
+            <w:vAlign w:val="center"/>
+          </w:tcPr>
+          <w:p>
+            <w:pPr>
+              <w:widowControl w:val="0"/>
+              <w:autoSpaceDE w:val="0"/>
+              <w:autoSpaceDN w:val="0"/>
+              <w:adjustRightInd w:val="0"/>
+              <w:jc w:val="center"/>
+              <w:rPr>
+                <w:bCs w:val="0"/>
+                <w:lang w:val="en-US"/>
+              </w:rPr>
+            </w:pPr>
+            <w:r>
+              <w:rPr>
+                <w:b/>
+                <w:bCs w:val="0"/>
+              </w:rPr>
+              <w:t>Precision</w:t>
+            </w:r>
+          </w:p>
+        </w:tc>
+        <w:tc>
+          <w:tcPr>
+            <w:tcW w:w="1230" w:type="dxa"/>
+            <w:vAlign w:val="center"/>
+          </w:tcPr>
+          <w:p>
+            <w:pPr>
+              <w:widowControl w:val="0"/>
+              <w:autoSpaceDE w:val="0"/>
+              <w:autoSpaceDN w:val="0"/>
+              <w:adjustRightInd w:val="0"/>
+              <w:jc w:val="center"/>
+              <w:rPr>
+                <w:bCs w:val="0"/>
+                <w:lang w:val="en-US"/>
+              </w:rPr>
+            </w:pPr>
+            <w:r>
+              <w:rPr>
+                <w:b/>
+                <w:bCs w:val="0"/>
+              </w:rPr>
+              <w:t>Recall</w:t>
+            </w:r>
+          </w:p>
+        </w:tc>
+        <w:tc>
+          <w:tcPr>
+            <w:tcW w:w="1230" w:type="dxa"/>
+            <w:vAlign w:val="center"/>
+          </w:tcPr>
+          <w:p>
+            <w:pPr>
+              <w:widowControl w:val="0"/>
+              <w:autoSpaceDE w:val="0"/>
+              <w:autoSpaceDN w:val="0"/>
+              <w:adjustRightInd w:val="0"/>
+              <w:jc w:val="center"/>
+              <w:rPr>
+                <w:bCs w:val="0"/>
+                <w:lang w:val="en-US"/>
+              </w:rPr>
+            </w:pPr>
+            <w:r>
+              <w:rPr>
+                <w:b/>
+                <w:bCs w:val="0"/>
+              </w:rPr>
+              <w:t>F1-score</w:t>
+            </w:r>
+          </w:p>
+        </w:tc>
+      </w:tr>
+      <w:tr>
+        <w:trPr>
+          <w:jc w:val="center"/>
+        </w:trPr>
+        <w:tc>
+          <w:tcPr>
+            <w:tcW w:w="1413" w:type="dxa"/>
+            <w:vAlign w:val="center"/>
+          </w:tcPr>
+          <w:p>
+            <w:pPr>
+              <w:widowControl w:val="0"/>
+              <w:autoSpaceDE w:val="0"/>
+              <w:autoSpaceDN w:val="0"/>
+              <w:adjustRightInd w:val="0"/>
+              <w:jc w:val="both"/>
+              <w:rPr>
+                <w:bCs w:val="0"/>
+                <w:lang w:val="en-US"/>
+              </w:rPr>
+            </w:pPr>
+            <w:r>
+              <w:t xml:space="preserve">Logistic </w:t>
+            </w:r>
+            <w:r>
+              <w:br/>
+              <w:t>Regression</w:t>
+            </w:r>
+          </w:p>
+        </w:tc>
+        <w:tc>
+          <w:tcPr>
+            <w:tcW w:w="1984" w:type="dxa"/>
+            <w:vAlign w:val="center"/>
+          </w:tcPr>
+          <w:p>
+            <w:pPr>
+              <w:widowControl w:val="0"/>
+              <w:autoSpaceDE w:val="0"/>
+              <w:autoSpaceDN w:val="0"/>
+              <w:adjustRightInd w:val="0"/>
+              <w:jc w:val="both"/>
+              <w:rPr>
+                <w:bCs w:val="0"/>
+                <w:lang w:val="en-US"/>
+              </w:rPr>
+            </w:pPr>
+            <w:r>
+              <w:t>Unigrams</w:t>
+            </w:r>
+          </w:p>
+        </w:tc>
+        <w:tc>
+          <w:tcPr>
+            <w:tcW w:w="1230" w:type="dxa"/>
+            <w:vAlign w:val="center"/>
+          </w:tcPr>
+          <w:p>
+            <w:pPr>
+              <w:widowControl w:val="0"/>
+              <w:autoSpaceDE w:val="0"/>
+              <w:autoSpaceDN w:val="0"/>
+              <w:adjustRightInd w:val="0"/>
+              <w:jc w:val="both"/>
+              <w:rPr>
+                <w:bCs w:val="0"/>
+                <w:lang w:val="en-US"/>
+              </w:rPr>
+            </w:pPr>
+            <w:r>
+              <w:t>0.9353</w:t>
+            </w:r>
+          </w:p>
+        </w:tc>
+        <w:tc>
+          <w:tcPr>
+            <w:tcW w:w="1230" w:type="dxa"/>
+            <w:vAlign w:val="center"/>
+          </w:tcPr>
+          <w:p>
+            <w:pPr>
+              <w:widowControl w:val="0"/>
+              <w:autoSpaceDE w:val="0"/>
+              <w:autoSpaceDN w:val="0"/>
+              <w:adjustRightInd w:val="0"/>
+              <w:jc w:val="both"/>
+              <w:rPr>
+                <w:bCs w:val="0"/>
+                <w:lang w:val="en-US"/>
+              </w:rPr>
+            </w:pPr>
+            <w:r>
+              <w:t>0.9254</w:t>
+            </w:r>
+          </w:p>
+        </w:tc>
+        <w:tc>
+          <w:tcPr>
+            <w:tcW w:w="1230" w:type="dxa"/>
+            <w:vAlign w:val="center"/>
+          </w:tcPr>
+          <w:p>
+            <w:pPr>
+              <w:widowControl w:val="0"/>
+              <w:autoSpaceDE w:val="0"/>
+              <w:autoSpaceDN w:val="0"/>
+              <w:adjustRightInd w:val="0"/>
+              <w:jc w:val="both"/>
+              <w:rPr>
+                <w:bCs w:val="0"/>
+                <w:lang w:val="en-US"/>
+              </w:rPr>
+            </w:pPr>
+            <w:r>
+              <w:t>0.9453</w:t>
+            </w:r>
+          </w:p>
+        </w:tc>
+        <w:tc>
+          <w:tcPr>
+            <w:tcW w:w="1230" w:type="dxa"/>
+            <w:vAlign w:val="center"/>
+          </w:tcPr>
+          <w:p>
+            <w:pPr>
+              <w:widowControl w:val="0"/>
+              <w:autoSpaceDE w:val="0"/>
+              <w:autoSpaceDN w:val="0"/>
+              <w:adjustRightInd w:val="0"/>
+              <w:jc w:val="both"/>
+              <w:rPr>
+                <w:bCs w:val="0"/>
+                <w:lang w:val="en-US"/>
+              </w:rPr>
+            </w:pPr>
+            <w:r>
+              <w:t>0.9351</w:t>
+            </w:r>
+          </w:p>
+        </w:tc>
+      </w:tr>
+      <w:tr>
+        <w:trPr>
+          <w:jc w:val="center"/>
+        </w:trPr>
+        <w:tc>
+          <w:tcPr>
+            <w:tcW w:w="1413" w:type="dxa"/>
+            <w:vAlign w:val="center"/>
+          </w:tcPr>
+          <w:p>
+            <w:pPr>
+              <w:widowControl w:val="0"/>
+              <w:autoSpaceDE w:val="0"/>
+              <w:autoSpaceDN w:val="0"/>
+              <w:adjustRightInd w:val="0"/>
+              <w:jc w:val="both"/>
+              <w:rPr>
+                <w:bCs w:val="0"/>
+                <w:lang w:val="en-US"/>
+              </w:rPr>
+            </w:pPr>
+            <w:r>
+              <w:t>Logistic</w:t>
+            </w:r>
+            <w:r>
+              <w:br/>
+              <w:t>Regression</w:t>
+            </w:r>
+          </w:p>
+        </w:tc>
+        <w:tc>
+          <w:tcPr>
+            <w:tcW w:w="1984" w:type="dxa"/>
+            <w:vAlign w:val="center"/>
+          </w:tcPr>
+          <w:p>
+            <w:pPr>
+              <w:widowControl w:val="0"/>
+              <w:autoSpaceDE w:val="0"/>
+              <w:autoSpaceDN w:val="0"/>
+              <w:adjustRightInd w:val="0"/>
+              <w:jc w:val="both"/>
+            </w:pPr>
+            <w:r>
+              <w:t xml:space="preserve">Unigrams + </w:t>
+            </w:r>
+          </w:p>
+          <w:p>
+            <w:pPr>
+              <w:widowControl w:val="0"/>
+              <w:autoSpaceDE w:val="0"/>
+              <w:autoSpaceDN w:val="0"/>
+              <w:adjustRightInd w:val="0"/>
+              <w:jc w:val="both"/>
+              <w:rPr>
+                <w:bCs w:val="0"/>
+                <w:lang w:val="en-US"/>
+              </w:rPr>
+            </w:pPr>
+            <w:r>
+              <w:t>bigrams</w:t>
+            </w:r>
+          </w:p>
+        </w:tc>
+        <w:tc>
+          <w:tcPr>
+            <w:tcW w:w="1230" w:type="dxa"/>
+            <w:vAlign w:val="center"/>
+          </w:tcPr>
+          <w:p>
+            <w:pPr>
+              <w:widowControl w:val="0"/>
+              <w:autoSpaceDE w:val="0"/>
+              <w:autoSpaceDN w:val="0"/>
+              <w:adjustRightInd w:val="0"/>
+              <w:jc w:val="both"/>
+              <w:rPr>
+                <w:bCs w:val="0"/>
+                <w:lang w:val="en-US"/>
+              </w:rPr>
+            </w:pPr>
+            <w:r>
+              <w:t>0.9530</w:t>
+            </w:r>
+          </w:p>
+        </w:tc>
+        <w:tc>
+          <w:tcPr>
+            <w:tcW w:w="1230" w:type="dxa"/>
+            <w:vAlign w:val="center"/>
+          </w:tcPr>
+          <w:p>
+            <w:pPr>
+              <w:widowControl w:val="0"/>
+              <w:autoSpaceDE w:val="0"/>
+              <w:autoSpaceDN w:val="0"/>
+              <w:adjustRightInd w:val="0"/>
+              <w:jc w:val="both"/>
+              <w:rPr>
+                <w:bCs w:val="0"/>
+                <w:lang w:val="en-US"/>
+              </w:rPr>
+            </w:pPr>
+            <w:r>
+              <w:t>0.9480</w:t>
+            </w:r>
+          </w:p>
+        </w:tc>
+        <w:tc>
+          <w:tcPr>
+            <w:tcW w:w="1230" w:type="dxa"/>
+            <w:vAlign w:val="center"/>
+          </w:tcPr>
+          <w:p>
+            <w:pPr>
+              <w:widowControl w:val="0"/>
+              <w:autoSpaceDE w:val="0"/>
+              <w:autoSpaceDN w:val="0"/>
+              <w:adjustRightInd w:val="0"/>
+              <w:jc w:val="both"/>
+              <w:rPr>
+                <w:bCs w:val="0"/>
+                <w:lang w:val="en-US"/>
+              </w:rPr>
+            </w:pPr>
+            <w:r>
+              <w:t>0.9640</w:t>
+            </w:r>
+          </w:p>
+        </w:tc>
+        <w:tc>
+          <w:tcPr>
+            <w:tcW w:w="1230" w:type="dxa"/>
+            <w:vAlign w:val="center"/>
+          </w:tcPr>
+          <w:p>
+            <w:pPr>
+              <w:widowControl w:val="0"/>
+              <w:autoSpaceDE w:val="0"/>
+              <w:autoSpaceDN w:val="0"/>
+              <w:adjustRightInd w:val="0"/>
+              <w:jc w:val="both"/>
+              <w:rPr>
+                <w:bCs w:val="0"/>
+                <w:lang w:val="en-US"/>
+              </w:rPr>
+            </w:pPr>
+            <w:r>
+              <w:t>0.9550</w:t>
+            </w:r>
+          </w:p>
+        </w:tc>
+      </w:tr>
+      <w:tr>
+        <w:trPr>
+          <w:jc w:val="center"/>
+        </w:trPr>
+        <w:tc>
+          <w:tcPr>
+            <w:tcW w:w="1413" w:type="dxa"/>
+            <w:vAlign w:val="center"/>
+          </w:tcPr>
+          <w:p>
+            <w:pPr>
+              <w:widowControl w:val="0"/>
+              <w:autoSpaceDE w:val="0"/>
+              <w:autoSpaceDN w:val="0"/>
+              <w:adjustRightInd w:val="0"/>
+              <w:jc w:val="both"/>
+              <w:rPr>
+                <w:bCs w:val="0"/>
+                <w:lang w:val="en-US"/>
+              </w:rPr>
+            </w:pPr>
+            <w:r>
+              <w:t>Linear SVM</w:t>
+            </w:r>
+          </w:p>
+        </w:tc>
+        <w:tc>
+          <w:tcPr>
+            <w:tcW w:w="1984" w:type="dxa"/>
+            <w:vAlign w:val="center"/>
+          </w:tcPr>
+          <w:p>
+            <w:pPr>
+              <w:widowControl w:val="0"/>
+              <w:autoSpaceDE w:val="0"/>
+              <w:autoSpaceDN w:val="0"/>
+              <w:adjustRightInd w:val="0"/>
+              <w:jc w:val="both"/>
+              <w:rPr>
+                <w:bCs w:val="0"/>
+                <w:lang w:val="en-US"/>
+              </w:rPr>
+            </w:pPr>
+            <w:r>
+              <w:t>Unigrams</w:t>
+            </w:r>
+          </w:p>
+        </w:tc>
+        <w:tc>
+          <w:tcPr>
+            <w:tcW w:w="1230" w:type="dxa"/>
+            <w:vAlign w:val="center"/>
+          </w:tcPr>
+          <w:p>
+            <w:pPr>
+              <w:widowControl w:val="0"/>
+              <w:autoSpaceDE w:val="0"/>
+              <w:autoSpaceDN w:val="0"/>
+              <w:adjustRightInd w:val="0"/>
+              <w:jc w:val="both"/>
+              <w:rPr>
+                <w:bCs w:val="0"/>
+                <w:lang w:val="en-US"/>
+              </w:rPr>
+            </w:pPr>
+            <w:r>
+              <w:t>0.9583</w:t>
+            </w:r>
+          </w:p>
+        </w:tc>
+        <w:tc>
+          <w:tcPr>
+            <w:tcW w:w="1230" w:type="dxa"/>
+            <w:vAlign w:val="center"/>
+          </w:tcPr>
+          <w:p>
+            <w:pPr>
+              <w:widowControl w:val="0"/>
+              <w:autoSpaceDE w:val="0"/>
+              <w:autoSpaceDN w:val="0"/>
+              <w:adjustRightInd w:val="0"/>
+              <w:jc w:val="both"/>
+              <w:rPr>
+                <w:bCs w:val="0"/>
+                <w:lang w:val="en-US"/>
+              </w:rPr>
+            </w:pPr>
+            <w:r>
+              <w:t>0.9434</w:t>
+            </w:r>
+          </w:p>
+        </w:tc>
+        <w:tc>
+          <w:tcPr>
+            <w:tcW w:w="1230" w:type="dxa"/>
+            <w:vAlign w:val="center"/>
+          </w:tcPr>
+          <w:p>
+            <w:pPr>
+              <w:widowControl w:val="0"/>
+              <w:autoSpaceDE w:val="0"/>
+              <w:autoSpaceDN w:val="0"/>
+              <w:adjustRightInd w:val="0"/>
+              <w:jc w:val="both"/>
+              <w:rPr>
+                <w:bCs w:val="0"/>
+                <w:lang w:val="en-US"/>
+              </w:rPr>
+            </w:pPr>
+            <w:r>
+              <w:t>0.9643</w:t>
+            </w:r>
+          </w:p>
+        </w:tc>
+        <w:tc>
+          <w:tcPr>
+            <w:tcW w:w="1230" w:type="dxa"/>
+            <w:vAlign w:val="center"/>
+          </w:tcPr>
+          <w:p>
+            <w:pPr>
+              <w:widowControl w:val="0"/>
+              <w:autoSpaceDE w:val="0"/>
+              <w:autoSpaceDN w:val="0"/>
+              <w:adjustRightInd w:val="0"/>
+              <w:jc w:val="both"/>
+              <w:rPr>
+                <w:bCs w:val="0"/>
+                <w:lang w:val="en-US"/>
+              </w:rPr>
+            </w:pPr>
+            <w:r>
+              <w:t>0.9533</w:t>
+            </w:r>
+          </w:p>
+        </w:tc>
+      </w:tr>
+      <w:tr>
+        <w:trPr>
+          <w:jc w:val="center"/>
+        </w:trPr>
+        <w:tc>
+          <w:tcPr>
+            <w:tcW w:w="1413" w:type="dxa"/>
+            <w:vAlign w:val="center"/>
+          </w:tcPr>
+          <w:p>
+            <w:pPr>
+              <w:widowControl w:val="0"/>
+              <w:autoSpaceDE w:val="0"/>
+              <w:autoSpaceDN w:val="0"/>
+              <w:adjustRightInd w:val="0"/>
+              <w:jc w:val="both"/>
+              <w:rPr>
+                <w:bCs w:val="0"/>
+                <w:lang w:val="en-US"/>
+              </w:rPr>
+            </w:pPr>
+            <w:r>
+              <w:t>Linear SVM</w:t>
+            </w:r>
+          </w:p>
+        </w:tc>
+        <w:tc>
+          <w:tcPr>
+            <w:tcW w:w="1984" w:type="dxa"/>
+            <w:vAlign w:val="center"/>
+          </w:tcPr>
+          <w:p>
+            <w:pPr>
+              <w:widowControl w:val="0"/>
+              <w:autoSpaceDE w:val="0"/>
+              <w:autoSpaceDN w:val="0"/>
+              <w:adjustRightInd w:val="0"/>
+              <w:jc w:val="both"/>
+            </w:pPr>
+            <w:r>
+              <w:t xml:space="preserve">Unigrams + </w:t>
+            </w:r>
+          </w:p>
+          <w:p>
+            <w:pPr>
+              <w:widowControl w:val="0"/>
+              <w:autoSpaceDE w:val="0"/>
+              <w:autoSpaceDN w:val="0"/>
+              <w:adjustRightInd w:val="0"/>
+              <w:jc w:val="both"/>
+              <w:rPr>
+                <w:bCs w:val="0"/>
+                <w:lang w:val="en-US"/>
+              </w:rPr>
+            </w:pPr>
+            <w:r>
+              <w:t>bigrams</w:t>
+            </w:r>
+          </w:p>
+        </w:tc>
+        <w:tc>
+          <w:tcPr>
+            <w:tcW w:w="1230" w:type="dxa"/>
+            <w:vAlign w:val="center"/>
+          </w:tcPr>
+          <w:p>
+            <w:pPr>
+              <w:widowControl w:val="0"/>
+              <w:autoSpaceDE w:val="0"/>
+              <w:autoSpaceDN w:val="0"/>
+              <w:adjustRightInd w:val="0"/>
+              <w:jc w:val="both"/>
+              <w:rPr>
+                <w:bCs w:val="0"/>
+                <w:lang w:val="en-US"/>
+              </w:rPr>
+            </w:pPr>
+            <w:r>
+              <w:t>0.9740</w:t>
+            </w:r>
+          </w:p>
+        </w:tc>
+        <w:tc>
+          <w:tcPr>
+            <w:tcW w:w="1230" w:type="dxa"/>
+            <w:vAlign w:val="center"/>
+          </w:tcPr>
+          <w:p>
+            <w:pPr>
+              <w:widowControl w:val="0"/>
+              <w:autoSpaceDE w:val="0"/>
+              <w:autoSpaceDN w:val="0"/>
+              <w:adjustRightInd w:val="0"/>
+              <w:jc w:val="both"/>
+              <w:rPr>
+                <w:bCs w:val="0"/>
+                <w:lang w:val="en-US"/>
+              </w:rPr>
+            </w:pPr>
+            <w:r>
+              <w:t>0.9650</w:t>
+            </w:r>
+          </w:p>
+        </w:tc>
+        <w:tc>
+          <w:tcPr>
+            <w:tcW w:w="1230" w:type="dxa"/>
+            <w:vAlign w:val="center"/>
+          </w:tcPr>
+          <w:p>
+            <w:pPr>
+              <w:widowControl w:val="0"/>
+              <w:autoSpaceDE w:val="0"/>
+              <w:autoSpaceDN w:val="0"/>
+              <w:adjustRightInd w:val="0"/>
+              <w:jc w:val="both"/>
+              <w:rPr>
+                <w:bCs w:val="0"/>
+                <w:lang w:val="en-US"/>
+              </w:rPr>
+            </w:pPr>
+            <w:r>
+              <w:t>0.9830</w:t>
+            </w:r>
+          </w:p>
+        </w:tc>
+        <w:tc>
+          <w:tcPr>
+            <w:tcW w:w="1230" w:type="dxa"/>
+            <w:vAlign w:val="center"/>
+          </w:tcPr>
+          <w:p>
+            <w:pPr>
+              <w:widowControl w:val="0"/>
+              <w:autoSpaceDE w:val="0"/>
+              <w:autoSpaceDN w:val="0"/>
+              <w:adjustRightInd w:val="0"/>
+              <w:jc w:val="both"/>
+              <w:rPr>
+                <w:bCs w:val="0"/>
+                <w:lang w:val="en-US"/>
+              </w:rPr>
+            </w:pPr>
+            <w:r>
+              <w:t>0.9730</w:t>
+            </w:r>
+          </w:p>
+        </w:tc>
+      </w:tr>
+    </w:tbl>
+    <w:p>
+      <w:pPr>
+        <w:widowControl w:val="0"/>
+        <w:autoSpaceDE w:val="0"/>
+        <w:autoSpaceDN w:val="0"/>
+        <w:adjustRightInd w:val="0"/>
+        <w:jc w:val="both"/>
+      </w:pPr>
+      <w:r>
+        <w:t xml:space="preserve">The results presented in Table 6 show that the inclusion of bigrams leads to a consistent improvement for both lexical classifiers. For </w:t>
+      </w:r>
+      <w:r>
+        <w:rPr>
+          <w:i/>
+          <w:iCs/>
+        </w:rPr>
+        <w:t>Logistic Regression</w:t>
+      </w:r>
+      <w:r>
+        <w:t xml:space="preserve">, the unigram–bigram configuration improves the accuracy from 0.9353 to 0.9530 and the F1-score from 0.9351 to 0.9550. A similar effect can be observed for the </w:t>
+      </w:r>
+      <w:r>
+        <w:rPr>
+          <w:i/>
+          <w:iCs/>
+        </w:rPr>
+        <w:t>linear SVM</w:t>
+      </w:r>
+      <w:r>
+        <w:t xml:space="preserve"> model, where the accuracy increases from 0.9583 to 0.9740 and the F1-score from 0.9533 to 0.9730. These results indicate that short multi-word patterns provide additional discriminative information beyond isolated lexical terms.</w:t>
+      </w:r>
+    </w:p>
+    <w:p>
+      <w:pPr>
+        <w:widowControl w:val="0"/>
+        <w:autoSpaceDE w:val="0"/>
+        <w:autoSpaceDN w:val="0"/>
+        <w:adjustRightInd w:val="0"/>
+        <w:jc w:val="both"/>
+        <w:rPr>
+          <w:bCs w:val="0"/>
+          <w:lang w:val="en-US"/>
+        </w:rPr>
+      </w:pPr>
+      <w:r>
+        <w:t xml:space="preserve">The observed gain is consistent with the nature of the task. AI-generated reviews often contain recurrent short expressions and standardized evaluative phrases that are only partially captured at unigram level. By incorporating bigrams, the </w:t>
+      </w:r>
+      <w:r>
+        <w:rPr>
+          <w:i/>
+          <w:iCs/>
+        </w:rPr>
+        <w:t>TF-IDF</w:t>
+      </w:r>
+      <w:r>
+        <w:t xml:space="preserve"> representation becomes more sensitive to such local contextual patterns, which contributes to the improved separation between authentic and generated reviews. This finding further supports the use of the unigram–bigram configuration in the final experimental setting.</w:t>
+      </w:r>
+    </w:p>
+    <w:p>
+      <w:pPr>
+        <w:widowControl w:val="0"/>
+        <w:autoSpaceDE w:val="0"/>
+        <w:autoSpaceDN w:val="0"/>
+        <w:adjustRightInd w:val="0"/>
+        <w:jc w:val="both"/>
+        <w:rPr>
+          <w:bCs w:val="0"/>
+          <w:lang w:val="en-US"/>
+        </w:rPr>
+      </w:pPr>
+    </w:p>
+    <w:p>
+      <w:pPr>
+        <w:widowControl w:val="0"/>
+        <w:autoSpaceDE w:val="0"/>
+        <w:autoSpaceDN w:val="0"/>
+        <w:adjustRightInd w:val="0"/>
+        <w:jc w:val="both"/>
+        <w:rPr>
+          <w:b/>
+          <w:lang w:val="en-US"/>
+        </w:rPr>
+      </w:pPr>
+      <w:r>
+        <w:rPr>
+          <w:b/>
+          <w:lang w:val="en-US"/>
+        </w:rPr>
+        <w:t xml:space="preserve">6 </w:t>
+      </w:r>
+      <w:r>
+        <w:rPr>
+          <w:b/>
+          <w:lang w:val="en-US"/>
+        </w:rPr>
+        <w:t>Explainability Analysi</w:t>
+      </w:r>
+      <w:r>
+        <w:rPr>
+          <w:b/>
+          <w:lang w:val="en-US"/>
+        </w:rPr>
+        <w:t>s</w:t>
+      </w:r>
+    </w:p>
+    <w:p>
+      <w:pPr>
+        <w:widowControl w:val="0"/>
+        <w:autoSpaceDE w:val="0"/>
+        <w:autoSpaceDN w:val="0"/>
+        <w:adjustRightInd w:val="0"/>
+        <w:jc w:val="both"/>
+        <w:rPr>
+          <w:bCs w:val="0"/>
+          <w:lang w:val="en-US"/>
+        </w:rPr>
+      </w:pPr>
+      <w:r>
+        <w:rPr>
+          <w:bCs w:val="0"/>
+          <w:lang w:val="en-US"/>
+        </w:rPr>
+        <w:t>T</w:t>
+      </w:r>
+      <w:r>
+        <w:rPr>
+          <w:bCs w:val="0"/>
+          <w:lang w:val="en-US"/>
+        </w:rPr>
+        <w:t>he classification results indicate that the proposed framework is effective in distinguishing between real and AI-generated reviews</w:t>
+      </w:r>
+      <w:r>
+        <w:rPr>
+          <w:bCs w:val="0"/>
+          <w:lang w:val="en-US"/>
+        </w:rPr>
+        <w:t>. However,</w:t>
+      </w:r>
+      <w:r>
+        <w:rPr>
+          <w:bCs w:val="0"/>
+          <w:lang w:val="en-US"/>
+        </w:rPr>
+        <w:t xml:space="preserve"> predictive performance alone does not explain which linguistic patterns drive the model decisions. This aspect is particularly relevant in the context of AI-generated fake review detection, where the distinction between manipulated and authentic content may depend on subtle lexical regularities rather than on obvious semantic cues [8], [17]. For this reason, an additional explainability analysis was conducted </w:t>
+      </w:r>
+      <w:proofErr w:type="gramStart"/>
+      <w:r>
+        <w:rPr>
+          <w:bCs w:val="0"/>
+          <w:lang w:val="en-US"/>
+        </w:rPr>
+        <w:t>in order to</w:t>
+      </w:r>
+      <w:proofErr w:type="gramEnd"/>
+      <w:r>
+        <w:rPr>
+          <w:bCs w:val="0"/>
+          <w:lang w:val="en-US"/>
+        </w:rPr>
+        <w:t xml:space="preserve"> identify the features that contribute most strongly to the classification process. The analysis was performed using </w:t>
+      </w:r>
+      <w:r>
+        <w:rPr>
+          <w:bCs w:val="0"/>
+          <w:i/>
+          <w:iCs/>
           <w:lang w:val="en-US"/>
         </w:rPr>
         <w:t>SHAP</w:t>
@@ -5188,7 +6831,15 @@
           <w:bCs w:val="0"/>
           <w:lang w:val="en-US"/>
         </w:rPr>
-        <w:t xml:space="preserve">, a model-agnostic explanation framework that quantifies the contribution of individual features to a given prediction [10]. The relevance of such an approach is also supported by recent work on explainable fake review detection and explainable e-commerce review analytics, which emphasizes that transparent model behavior is essential for understanding the mechanisms underlying manipulated textual content [9], [18]. In the present study, </w:t>
+        <w:t xml:space="preserve">, a model-agnostic explanation framework that quantifies the contribution of individual features to a given prediction [10]. The relevance of such an approach is also supported by recent work on explainable fake review detection and explainable e-commerce review analytics, which emphasizes that transparent model behavior is essential for </w:t>
+      </w:r>
+      <w:r>
+        <w:rPr>
+          <w:bCs w:val="0"/>
+          <w:lang w:val="en-US"/>
+        </w:rPr>
+        <w:lastRenderedPageBreak/>
+        <w:t xml:space="preserve">understanding the mechanisms underlying manipulated textual content [9], [18]. In the present study, </w:t>
       </w:r>
       <w:r>
         <w:rPr>
@@ -5299,7 +6950,6 @@
           <w:noProof/>
           <w:lang w:val="en-US"/>
         </w:rPr>
-        <w:lastRenderedPageBreak/>
         <w:drawing>
           <wp:inline distT="0" distB="0" distL="0" distR="0" wp14:anchorId="2FD2BA8E" wp14:editId="15C6389F">
             <wp:extent cx="2763078" cy="3199671"/>
@@ -5390,6 +7040,14 @@
           <w:noProof/>
           <w:lang w:val="en-US"/>
         </w:rPr>
+        <w:t xml:space="preserve">Linear </w:t>
+      </w:r>
+      <w:r>
+        <w:rPr>
+          <w:bCs w:val="0"/>
+          <w:noProof/>
+          <w:lang w:val="en-US"/>
+        </w:rPr>
         <w:t>SVM</w:t>
       </w:r>
       <w:r>
@@ -5431,21 +7089,7 @@
           <w:bCs w:val="0"/>
           <w:lang w:val="en-US"/>
         </w:rPr>
-        <w:t xml:space="preserve">Figure </w:t>
-      </w:r>
-      <w:r>
-        <w:rPr>
-          <w:bCs w:val="0"/>
-          <w:lang w:val="en-US"/>
-        </w:rPr>
-        <w:t>3</w:t>
-      </w:r>
-      <w:r>
-        <w:rPr>
-          <w:bCs w:val="0"/>
-          <w:lang w:val="en-US"/>
-        </w:rPr>
-        <w:t xml:space="preserve"> presents the </w:t>
+        <w:t xml:space="preserve">Figure 3 presents the </w:t>
       </w:r>
       <w:r>
         <w:rPr>
@@ -5461,7 +7105,7 @@
           <w:bCs w:val="0"/>
           <w:lang w:val="en-US"/>
         </w:rPr>
-        <w:t xml:space="preserve"> summary plot obtained for the </w:t>
+        <w:t xml:space="preserve"> summary plot obtained for the linear </w:t>
       </w:r>
       <w:r>
         <w:rPr>
@@ -5470,7 +7114,7 @@
           <w:iCs/>
           <w:lang w:val="en-US"/>
         </w:rPr>
-        <w:t>Logistic Regression</w:t>
+        <w:t>SVM</w:t>
       </w:r>
       <w:r>
         <w:rPr>
@@ -5509,119 +7153,7 @@
           <w:bCs w:val="0"/>
           <w:lang w:val="en-US"/>
         </w:rPr>
-        <w:t xml:space="preserve"> values indicate features that increase the probability of the AI-generated class, whereas negative values correspond to features more strongly associated with authentic reviews. The plot shows that the classification is influenced mainly by a limited subset of lexical features, including </w:t>
-      </w:r>
-      <w:r>
-        <w:rPr>
-          <w:bCs w:val="0"/>
-          <w:i/>
-          <w:iCs/>
-          <w:lang w:val="en-US"/>
-        </w:rPr>
-        <w:t>little</w:t>
-      </w:r>
-      <w:r>
-        <w:rPr>
-          <w:bCs w:val="0"/>
-          <w:lang w:val="en-US"/>
-        </w:rPr>
-        <w:t xml:space="preserve">, </w:t>
-      </w:r>
-      <w:r>
-        <w:rPr>
-          <w:bCs w:val="0"/>
-          <w:i/>
-          <w:iCs/>
-          <w:lang w:val="en-US"/>
-        </w:rPr>
-        <w:t>really</w:t>
-      </w:r>
-      <w:r>
-        <w:rPr>
-          <w:bCs w:val="0"/>
-          <w:lang w:val="en-US"/>
-        </w:rPr>
-        <w:t xml:space="preserve">, </w:t>
-      </w:r>
-      <w:r>
-        <w:rPr>
-          <w:bCs w:val="0"/>
-          <w:i/>
-          <w:iCs/>
-          <w:lang w:val="en-US"/>
-        </w:rPr>
-        <w:t>product</w:t>
-      </w:r>
-      <w:r>
-        <w:rPr>
-          <w:bCs w:val="0"/>
-          <w:lang w:val="en-US"/>
-        </w:rPr>
-        <w:t xml:space="preserve">, </w:t>
-      </w:r>
-      <w:r>
-        <w:rPr>
-          <w:bCs w:val="0"/>
-          <w:i/>
-          <w:iCs/>
-          <w:lang w:val="en-US"/>
-        </w:rPr>
-        <w:t>wish</w:t>
-      </w:r>
-      <w:r>
-        <w:rPr>
-          <w:bCs w:val="0"/>
-          <w:lang w:val="en-US"/>
-        </w:rPr>
-        <w:t xml:space="preserve">, </w:t>
-      </w:r>
-      <w:r>
-        <w:rPr>
-          <w:bCs w:val="0"/>
-          <w:i/>
-          <w:iCs/>
-          <w:lang w:val="en-US"/>
-        </w:rPr>
-        <w:t>bit</w:t>
-      </w:r>
-      <w:r>
-        <w:rPr>
-          <w:bCs w:val="0"/>
-          <w:lang w:val="en-US"/>
-        </w:rPr>
-        <w:t xml:space="preserve">, </w:t>
-      </w:r>
-      <w:r>
-        <w:rPr>
-          <w:bCs w:val="0"/>
-          <w:i/>
-          <w:iCs/>
-          <w:lang w:val="en-US"/>
-        </w:rPr>
-        <w:t>recommend</w:t>
-      </w:r>
-      <w:r>
-        <w:rPr>
-          <w:bCs w:val="0"/>
-          <w:lang w:val="en-US"/>
-        </w:rPr>
-        <w:t xml:space="preserve">, </w:t>
-      </w:r>
-      <w:r>
-        <w:rPr>
-          <w:bCs w:val="0"/>
-          <w:i/>
-          <w:iCs/>
-          <w:lang w:val="en-US"/>
-        </w:rPr>
-        <w:t>great</w:t>
-      </w:r>
-      <w:r>
-        <w:rPr>
-          <w:bCs w:val="0"/>
-          <w:lang w:val="en-US"/>
-        </w:rPr>
-        <w:t xml:space="preserve">, </w:t>
+        <w:t xml:space="preserve"> values indicate features that increase the probability of the AI-generated class, whereas negative values correspond to features more strongly associated with authentic reviews. The plot shows that the classification is influenced mainly by a limited subset of lexical features, including little, really, product, wish, bit, recommend, great, </w:t>
       </w:r>
       <w:proofErr w:type="gramStart"/>
       <w:r>
@@ -5629,16 +7161,7 @@
           <w:bCs w:val="0"/>
           <w:lang w:val="en-US"/>
         </w:rPr>
-        <w:t xml:space="preserve">and </w:t>
-      </w:r>
-      <w:r>
-        <w:rPr>
-          <w:bCs w:val="0"/>
-          <w:i/>
-          <w:iCs/>
-          <w:lang w:val="en-US"/>
-        </w:rPr>
-        <w:t>definitely</w:t>
+        <w:t>and definitely</w:t>
       </w:r>
       <w:proofErr w:type="gramEnd"/>
       <w:r>
@@ -5646,14 +7169,7 @@
           <w:bCs w:val="0"/>
           <w:lang w:val="en-US"/>
         </w:rPr>
-        <w:t>.</w:t>
-      </w:r>
-      <w:r>
-        <w:rPr>
-          <w:bCs w:val="0"/>
-          <w:lang w:val="en-US"/>
-        </w:rPr>
-        <w:t xml:space="preserve"> These results suggest that the model captures recurring lexical and stylistic regularities rather than product-specific semantic content. The presence of general evaluative expressions and mild balancing markers further indicates that generated reviews tend to follow more uniform and predictable patterns.</w:t>
+        <w:t>. These results suggest that the model captures recurring lexical and stylistic regularities rather than product-specific semantic content. The presence of general evaluative expressions and mild balancing markers further indicates that generated reviews tend to follow more uniform and predictable patterns.</w:t>
       </w:r>
     </w:p>
     <w:p>
@@ -5673,133 +7189,7 @@
           <w:bCs w:val="0"/>
           <w:lang w:val="en-US"/>
         </w:rPr>
-        <w:t xml:space="preserve">The feature distribution shown in Figure </w:t>
-      </w:r>
-      <w:r>
-        <w:rPr>
-          <w:bCs w:val="0"/>
-          <w:lang w:val="en-US"/>
-        </w:rPr>
-        <w:t>3</w:t>
-      </w:r>
-      <w:r>
-        <w:rPr>
-          <w:bCs w:val="0"/>
-          <w:lang w:val="en-US"/>
-        </w:rPr>
-        <w:t xml:space="preserve"> suggests that the classification is influenced mainly by recurrent lexical regularities rather than by product-specific semantic content. Positive evaluative terms such as </w:t>
-      </w:r>
-      <w:r>
-        <w:rPr>
-          <w:bCs w:val="0"/>
-          <w:i/>
-          <w:iCs/>
-          <w:lang w:val="en-US"/>
-        </w:rPr>
-        <w:t>recommend</w:t>
-      </w:r>
-      <w:r>
-        <w:rPr>
-          <w:bCs w:val="0"/>
-          <w:lang w:val="en-US"/>
-        </w:rPr>
-        <w:t xml:space="preserve">, </w:t>
-      </w:r>
-      <w:r>
-        <w:rPr>
-          <w:bCs w:val="0"/>
-          <w:i/>
-          <w:iCs/>
-          <w:lang w:val="en-US"/>
-        </w:rPr>
-        <w:t>great</w:t>
-      </w:r>
-      <w:r>
-        <w:rPr>
-          <w:bCs w:val="0"/>
-          <w:lang w:val="en-US"/>
-        </w:rPr>
-        <w:t xml:space="preserve">, </w:t>
-      </w:r>
-      <w:r>
-        <w:rPr>
-          <w:bCs w:val="0"/>
-          <w:i/>
-          <w:iCs/>
-          <w:lang w:val="en-US"/>
-        </w:rPr>
-        <w:t>happy</w:t>
-      </w:r>
-      <w:r>
-        <w:rPr>
-          <w:bCs w:val="0"/>
-          <w:lang w:val="en-US"/>
-        </w:rPr>
-        <w:t xml:space="preserve">, and </w:t>
-      </w:r>
-      <w:r>
-        <w:rPr>
-          <w:bCs w:val="0"/>
-          <w:i/>
-          <w:iCs/>
-          <w:lang w:val="en-US"/>
-        </w:rPr>
-        <w:t>easy</w:t>
-      </w:r>
-      <w:r>
-        <w:rPr>
-          <w:bCs w:val="0"/>
-          <w:lang w:val="en-US"/>
-        </w:rPr>
-        <w:t xml:space="preserve"> are among the most relevant indicators of the AI-generated class, while terms such as </w:t>
-      </w:r>
-      <w:r>
-        <w:rPr>
-          <w:bCs w:val="0"/>
-          <w:i/>
-          <w:iCs/>
-          <w:lang w:val="en-US"/>
-        </w:rPr>
-        <w:t>little</w:t>
-      </w:r>
-      <w:r>
-        <w:rPr>
-          <w:bCs w:val="0"/>
-          <w:lang w:val="en-US"/>
-        </w:rPr>
-        <w:t xml:space="preserve">, </w:t>
-      </w:r>
-      <w:r>
-        <w:rPr>
-          <w:bCs w:val="0"/>
-          <w:i/>
-          <w:iCs/>
-          <w:lang w:val="en-US"/>
-        </w:rPr>
-        <w:t>bit</w:t>
-      </w:r>
-      <w:r>
-        <w:rPr>
-          <w:bCs w:val="0"/>
-          <w:lang w:val="en-US"/>
-        </w:rPr>
-        <w:t xml:space="preserve">, and </w:t>
-      </w:r>
-      <w:r>
-        <w:rPr>
-          <w:bCs w:val="0"/>
-          <w:i/>
-          <w:iCs/>
-          <w:lang w:val="en-US"/>
-        </w:rPr>
-        <w:t>wish</w:t>
-      </w:r>
-      <w:r>
-        <w:rPr>
-          <w:bCs w:val="0"/>
-          <w:lang w:val="en-US"/>
-        </w:rPr>
-        <w:t xml:space="preserve"> reflect the presence of mild balancing or attenuating constructions. These findings indicate that generated reviews tend to follow more uniform and predictable phrasing patterns. In this sense, the explainability analysis complements the quantitative results by showing that the learned separation between the two classes is associated primarily with differences in stylistic consistency and lexical formulation.</w:t>
+        <w:t>The feature distribution shown in Figure 3 suggests that the classification is influenced mainly by recurrent lexical regularities rather than by product-specific semantic content. Positive evaluative terms such as recommend, great, happy, and easy are among the most relevant indicators of the AI-generated class, while terms such as little, bit, and wish contribute positively when they occur, pointing to the presence of mild balancing or attenuating constructions. These findings indicate that generated reviews tend to follow more uniform and predictable phrasing patterns. In this sense, the explainability analysis complements the quantitative results by showing that the learned separation between the two classes is associated primarily with differences in stylistic consistency and lexical formulation.</w:t>
       </w:r>
     </w:p>
     <w:p>
@@ -5809,11 +7199,28 @@
         <w:autoSpaceDN w:val="0"/>
         <w:adjustRightInd w:val="0"/>
         <w:jc w:val="both"/>
-        <w:rPr>
-          <w:bCs w:val="0"/>
-          <w:lang w:val="en-US"/>
-        </w:rPr>
-      </w:pPr>
+      </w:pPr>
+      <w:r>
+        <w:t xml:space="preserve">The </w:t>
+      </w:r>
+      <w:r>
+        <w:rPr>
+          <w:i/>
+          <w:iCs/>
+        </w:rPr>
+        <w:t>SHAP</w:t>
+      </w:r>
+      <w:r>
+        <w:t xml:space="preserve"> distribution also provides a more detailed view of how individual features influence the decision function across different samples. Features placed higher in the plot have a stronger average impact on the model output, while the horizontal spread reflects the variation of their contribution across the dataset. In addition, the </w:t>
+      </w:r>
+      <w:proofErr w:type="spellStart"/>
+      <w:r>
+        <w:t>color</w:t>
+      </w:r>
+      <w:proofErr w:type="spellEnd"/>
+      <w:r>
+        <w:t xml:space="preserve"> gradient indicates the feature value, making it possible to distinguish between the effect of feature presence and the effect of feature absence. This aspect is particularly relevant in the present study, since some terms become strongly discriminative only when they occur in the review, whereas their absence has little or no contribution to the final prediction.</w:t>
+      </w:r>
     </w:p>
     <w:p>
       <w:pPr>
@@ -5822,38 +7229,18 @@
         <w:autoSpaceDN w:val="0"/>
         <w:adjustRightInd w:val="0"/>
         <w:jc w:val="both"/>
-        <w:rPr>
-          <w:b/>
-          <w:lang w:val="en-US"/>
-        </w:rPr>
-      </w:pPr>
-      <w:r>
-        <w:rPr>
-          <w:b/>
-          <w:lang w:val="en-US"/>
-        </w:rPr>
-        <w:t xml:space="preserve">7 </w:t>
-      </w:r>
-      <w:r>
-        <w:rPr>
-          <w:b/>
-          <w:lang w:val="en-US"/>
-        </w:rPr>
-        <w:t>Discussion</w:t>
-      </w:r>
-      <w:r>
-        <w:rPr>
-          <w:b/>
-          <w:lang w:val="en-US"/>
-        </w:rPr>
-        <w:t xml:space="preserve"> </w:t>
-      </w:r>
-      <w:r>
-        <w:rPr>
-          <w:b/>
-          <w:lang w:val="en-US"/>
-        </w:rPr>
-        <w:t>and Limitations</w:t>
+      </w:pPr>
+      <w:r>
+        <w:lastRenderedPageBreak/>
+        <w:t xml:space="preserve">From a practical perspective, the explainability analysis is useful not only for interpreting the current classifier, but also for assessing the robustness of the overall detection framework. By identifying the lexical cues that contribute most strongly to the AI-generated class, the analysis helps determine whether the model relies on plausible stylistic regularities or on accidental artifacts of the dataset. In the present case, the most influential features are consistent with the observed properties of generated reviews, namely generic positive evaluations, mild balancing constructions, and relatively standardized phrasing. At the same time, these explanations remain specific to the current dataset and feature </w:t>
+      </w:r>
+      <w:proofErr w:type="gramStart"/>
+      <w:r>
+        <w:t>representation, and</w:t>
+      </w:r>
+      <w:proofErr w:type="gramEnd"/>
+      <w:r>
+        <w:t xml:space="preserve"> therefore should not be interpreted as universal markers of AI-generated reviews in all e-commerce settings.</w:t>
       </w:r>
     </w:p>
     <w:p>
@@ -5864,10 +7251,13 @@
         <w:adjustRightInd w:val="0"/>
         <w:jc w:val="both"/>
         <w:rPr>
-          <w:b/>
-          <w:lang w:val="en-US"/>
-        </w:rPr>
-      </w:pPr>
+          <w:bCs w:val="0"/>
+          <w:lang w:val="en-US"/>
+        </w:rPr>
+      </w:pPr>
+      <w:r>
+        <w:t>These observations provide a useful basis for discussing both the strengths and the limitations of the proposed framework, as presented in the next section.</w:t>
+      </w:r>
     </w:p>
     <w:p>
       <w:pPr>
@@ -5877,24 +7267,10 @@
         <w:adjustRightInd w:val="0"/>
         <w:jc w:val="both"/>
         <w:rPr>
-          <w:b/>
-          <w:lang w:val="en-US"/>
-        </w:rPr>
-      </w:pPr>
-      <w:r>
-        <w:rPr>
-          <w:b/>
-          <w:lang w:val="en-US"/>
-        </w:rPr>
-        <w:t xml:space="preserve">8 </w:t>
-      </w:r>
-      <w:r>
-        <w:rPr>
-          <w:b/>
-          <w:lang w:val="en-US"/>
-        </w:rPr>
-        <w:t>Conclusion</w:t>
-      </w:r>
+          <w:bCs w:val="0"/>
+          <w:lang w:val="en-US"/>
+        </w:rPr>
+      </w:pPr>
     </w:p>
     <w:p>
       <w:pPr>
@@ -5908,6 +7284,34 @@
           <w:lang w:val="en-US"/>
         </w:rPr>
       </w:pPr>
+      <w:r>
+        <w:rPr>
+          <w:b/>
+          <w:lang w:val="en-US"/>
+        </w:rPr>
+        <w:t xml:space="preserve">7 </w:t>
+      </w:r>
+      <w:r>
+        <w:rPr>
+          <w:b/>
+          <w:lang w:val="en-US"/>
+        </w:rPr>
+        <w:t>Discussion</w:t>
+      </w:r>
+      <w:r>
+        <w:rPr>
+          <w:b/>
+          <w:lang w:val="en-US"/>
+        </w:rPr>
+        <w:t xml:space="preserve"> </w:t>
+      </w:r>
+      <w:r>
+        <w:rPr>
+          <w:b/>
+          <w:lang w:val="en-US"/>
+        </w:rPr>
+        <w:t>and Limitations</w:t>
+      </w:r>
     </w:p>
     <w:p>
       <w:pPr>
@@ -5930,6 +7334,59 @@
         <w:adjustRightInd w:val="0"/>
         <w:jc w:val="both"/>
         <w:rPr>
+          <w:b/>
+          <w:lang w:val="en-US"/>
+        </w:rPr>
+      </w:pPr>
+      <w:r>
+        <w:rPr>
+          <w:b/>
+          <w:lang w:val="en-US"/>
+        </w:rPr>
+        <w:t xml:space="preserve">8 </w:t>
+      </w:r>
+      <w:r>
+        <w:rPr>
+          <w:b/>
+          <w:lang w:val="en-US"/>
+        </w:rPr>
+        <w:t>Conclusion</w:t>
+      </w:r>
+    </w:p>
+    <w:p>
+      <w:pPr>
+        <w:widowControl w:val="0"/>
+        <w:autoSpaceDE w:val="0"/>
+        <w:autoSpaceDN w:val="0"/>
+        <w:adjustRightInd w:val="0"/>
+        <w:jc w:val="both"/>
+        <w:rPr>
+          <w:b/>
+          <w:lang w:val="en-US"/>
+        </w:rPr>
+      </w:pPr>
+    </w:p>
+    <w:p>
+      <w:pPr>
+        <w:widowControl w:val="0"/>
+        <w:autoSpaceDE w:val="0"/>
+        <w:autoSpaceDN w:val="0"/>
+        <w:adjustRightInd w:val="0"/>
+        <w:jc w:val="both"/>
+        <w:rPr>
+          <w:b/>
+          <w:lang w:val="en-US"/>
+        </w:rPr>
+      </w:pPr>
+    </w:p>
+    <w:p>
+      <w:pPr>
+        <w:widowControl w:val="0"/>
+        <w:autoSpaceDE w:val="0"/>
+        <w:autoSpaceDN w:val="0"/>
+        <w:adjustRightInd w:val="0"/>
+        <w:jc w:val="both"/>
+        <w:rPr>
           <w:lang w:val="en-US"/>
         </w:rPr>
       </w:pPr>
@@ -6012,7 +7469,6 @@
         <w:jc w:val="both"/>
       </w:pPr>
       <w:r>
-        <w:lastRenderedPageBreak/>
         <w:t xml:space="preserve">[3] </w:t>
       </w:r>
       <w:r>
@@ -6249,6 +7705,7 @@
         <w:jc w:val="both"/>
       </w:pPr>
       <w:r>
+        <w:lastRenderedPageBreak/>
         <w:t xml:space="preserve">[13] </w:t>
       </w:r>
       <w:r>
@@ -6399,7 +7856,6 @@
         <w:jc w:val="both"/>
       </w:pPr>
       <w:r>
-        <w:lastRenderedPageBreak/>
         <w:t xml:space="preserve">[21] </w:t>
       </w:r>
       <w:r>
@@ -6691,6 +8147,7 @@
               <w:rPr>
                 <w:noProof/>
               </w:rPr>
+              <w:lastRenderedPageBreak/>
               <w:drawing>
                 <wp:inline distT="0" distB="0" distL="0" distR="0" wp14:anchorId="5A0FF28A" wp14:editId="6A9B2F68">
                   <wp:extent cx="901290" cy="1078992"/>
@@ -12699,7 +14156,7 @@
   <w:style w:type="paragraph" w:default="1" w:styleId="Normal">
     <w:name w:val="Normal"/>
     <w:qFormat/>
-    <w:rsid w:val="00F0138E"/>
+    <w:rsid w:val="009F4246"/>
     <w:rPr>
       <w:bCs/>
       <w:sz w:val="24"/>
@@ -12789,7 +14246,6 @@
   <w:style w:type="character" w:default="1" w:styleId="DefaultParagraphFont">
     <w:name w:val="Default Paragraph Font"/>
     <w:uiPriority w:val="1"/>
-    <w:semiHidden/>
     <w:unhideWhenUsed/>
   </w:style>
   <w:style w:type="table" w:default="1" w:styleId="TableNormal">

</xml_diff>